<commit_message>
Close the loop in Chapter 3 draft: retroactive audit, split-strategy limitation, file-count fact-check
Section 3.5 now reports the retroactive audit results (req_switch found
and excluded, shared/qos/partition checked and cleared, F-DATA's
jobenv_req found milder but left active) rather than ending at the
three-flag decision as if vetting were complete. Added the split-strategy
limitation (PM100's heavy users span 97-100% of the dataset's time range,
so a chronological split doesn't strand them -- checked for PM100 only,
F-DATA still needs the same check). Fixed the F-DATA file-count sentence
to state explicitly that all 38 files were confirmed present via a
directory listing, rather than leaving the earlier "X / 38 expected"
uncertainty unaddressed.
</commit_message>
<xml_diff>
--- a/writing/thesis_draft_notes.docx
+++ b/writing/thesis_draft_notes.docx
@@ -38,7 +38,7 @@
     </w:p>
     <w:p>
       <w:r>
-        <w:t>F-DATA arrived as 38 monthly parquet files, one per month from March 2021 through April 2024, totaling 25,866,900 job records — a number I confirmed directly from parquet metadata rather than the approximately-24-million figure quoted in the dataset's own paper. PM100 is a single file of 231,238 jobs from Marconi100, covering May through October 2020.</w:t>
+        <w:t>F-DATA arrived as 38 monthly parquet files, one per month from March 2021 through April 2024, totaling 25,866,900 job records — a number I confirmed directly from parquet metadata rather than the approximately-24-million figure quoted in the dataset's own paper. The file count is worth stating carefully: when this pipeline first ran, only one of the 38 files had actually been downloaded, and the loading code printed how many of the expected 38 it found rather than assuming the full set was present. All 38 were confirmed present by listing the directory directly — March 2021 through April 2024 with no gaps — before any of the numbers in this chapter that depend on the full date range were computed. PM100 is a single file of 231,238 jobs from Marconi100, covering May through October 2020.</w:t>
       </w:r>
     </w:p>
     <w:p>
@@ -460,6 +460,16 @@
       </w:r>
     </w:p>
     <w:p>
+      <w:r>
+        <w:t>That decision covers three candidate features. It says nothing about whether the same problem was already sitting undetected somewhere in the feature set built before this vetting process existed, so I went back and ran the same concentration check against every PM100 Tier A column that predates it. One failed outright: req_switch, a Slurm switch-count field already in active use, has only 13 non-zero values across 180,310 completed jobs, and all 13 come from a single user — a worse concentration ratio than threads_per_core_set, which had already been excluded for the same reason. req_switch has now been moved to the same reserved category, with a derived req_switch_set flag preserved alongside it for consistency. The rest of the audit came back clean: shared's two populated categories each hold tens of thousands of jobs, nowhere near single-user territory, and the smallest categories of qos and partition, while occasionally tiny, are legitimate multi-valued scheduling fields rather than purpose-built rare flags, so ordinary small-category noise there is not the same concern. F-DATA's one comparable column, jobenv_req, showed a milder version of the same pattern — its minority value spans 21 users with a 39.2 percent top-user share, above F-DATA's own baseline concentration of 16.0 percent but well short of PM100's excluded flags — and is left active for now, flagged for a second look once more months of F-DATA are loaded.</w:t>
+      </w:r>
+    </w:p>
+    <w:p>
+      <w:r>
+        <w:t>There is a second, broader question this whole exercise raised that is worth stating on its own rather than folding into the feature-by-feature discussion above: given that a handful of users account for close to half of all jobs in both datasets, does the chronological train/test split planned for later chapters risk giving an unrepresentative slice of any one heavy user's jobs to training versus testing? I checked this for PM100's five heaviest users directly, rather than leaving it as an open question. All five are active across 97 to 100 percent of the dataset's full 159-day span, with one exception reaching 76 percent after starting roughly a month into the window — none of them are concentrated in a narrow slice of time that a chronological split could isolate entirely on one side. That is a reassuring result, but it is specific to PM100. F-DATA spans 38 months rather than 6, which is a much longer window for a user's activity to plausibly shift, taper off, or start partway through before the dataset ends, and that check has not yet been run there. The Feature Vetting method described in this section should be treated as an ongoing discipline for this thesis rather than a step that was completed once and closed — the fact that it caught req_switch on a second pass, after already being applied once, is itself the argument for continuing to apply it as new features and the full-scale dataset come into the pipeline.</w:t>
+      </w:r>
+    </w:p>
+    <w:p>
       <w:pPr>
         <w:pStyle w:val="Heading2"/>
       </w:pPr>

</xml_diff>

<commit_message>
Add Section 5.4 Analytical Baselines, documenting notebook 03
Covers the chronological split (first documented here), F-DATA's
Hierarchical Roofline (job-total verification, 99.99% pclass agreement,
Roofline vs. naive baseline results on the test split), and PM100's
calibrated power model (the node_power_consumption per-node-vs-job-total
correction, the multicollinearity caveat on its coefficients, R2 0.910
vs. naive's 0.096). Figures 5.1-5.3 extracted from the executed
notebook's real outputs. Chapter 3 left untouched; 5.4 cross-references
and corrects 3.2's now-outdated per-node claim without editing it
directly (tracked as an open follow-up in WRITING_TRACKER.md).
</commit_message>
<xml_diff>
--- a/writing/thesis_draft_notes.docx
+++ b/writing/thesis_draft_notes.docx
@@ -549,6 +549,232 @@
         <w:t>Notebooks are now executed with papermill rather than plain jupyter nbconvert, specifically because nbconvert only writes output once execution finishes entirely, which gives no way to distinguish a slow cell from a stalled one while it is running. papermill logs each cell's start and end as it happens, which is what actually resolved the hanging-versus-slow question above rather than guesswork based on process CPU time.</w:t>
       </w:r>
     </w:p>
+    <w:p>
+      <w:pPr>
+        <w:pStyle w:val="Heading2"/>
+      </w:pPr>
+      <w:r>
+        <w:t>5.4 Analytical Baselines</w:t>
+      </w:r>
+    </w:p>
+    <w:p>
+      <w:r>
+        <w:t>Notebook 03 built the two analytical baselines the plan calls for: a Hierarchical Roofline model for F-DATA, and a calibrated resource-utilization power model for PM100. The two datasets need different treatments here, not just different numbers — F-DATA has the hardware performance counters Roofline requires, and PM100 does not, a distinction established already in Section 3.1.</w:t>
+      </w:r>
+    </w:p>
+    <w:p>
+      <w:r>
+        <w:t>F-DATA was loaded as six consecutive monthly files, March through August 2021, rather than the scattered-month sampling used in notebooks 01 and 02. The chronological train/test split this notebook needed only makes sense across a real, contiguous span of time, and six scattered months would not have given one. PM100 was loaded in full, as it has been throughout. Both datasets were filtered to completed jobs only, the same filter used since Section 3.6: 10.5 percent of F-DATA's 2,897,734 loaded rows were excluded on this six-month slice, and 22.0 percent of PM100's 231,238 rows. That PM100 figure is measured on this notebook's own six-month window and is not the same measurement as the 21.0 percent reported in Section 3.6 against a different sample — the two numbers are close but come from different slices of the dataset, not from the same computation repeated.</w:t>
+      </w:r>
+    </w:p>
+    <w:p>
+      <w:r>
+        <w:t>A chronological split was implemented for the first time in this notebook: 70 percent of each dataset's rows by submission time go to training, the remaining 30 percent to testing, with the boundary itself computed as a quantile of submission time rather than hand-picked. For F-DATA that boundary fell on July 1, 2021, giving 1,815,596 training rows and 777,528 test rows. For PM100 it fell on September 19, 2020, giving 126,217 training rows and 54,093 test rows. This split is now implemented once, in a shared module, so every notebook from here forward compares models against the same boundary rather than each picking its own.</w:t>
+      </w:r>
+    </w:p>
+    <w:p>
+      <w:r>
+        <w:t>F-DATA's Roofline ceiling comes from the A64FX processor's published specifications: 3.3792 teraFLOP/s double-precision peak and 1024 gigabytes/second of peak HBM2 bandwidth, both per node. Before trusting any of this, I checked two things directly against the data rather than assuming them from the column documentation. First, that opint, F-DATA's own operational-intensity field, actually equals flops divided by mbwidth: it does, with a relative error of 0.00e+00 across all 2,593,124 completed jobs in this sample, meaning F-DATA's authors precompute it exactly and I did not need to recompute it myself. Second, that flops and mbwidth are job-wide totals rather than per-node figures, the same question Section 3.2 raised about avgpcon. The check was direct: 977 jobs appear to exceed the A64FX's single-node peak FLOP/s if node count is ignored, but zero jobs exceed it once each job's rate is divided by its node count. Both fields are job-wide totals, so the ceiling applied below is scaled by each job's node count before comparison.</w:t>
+      </w:r>
+    </w:p>
+    <w:p>
+      <w:pPr>
+        <w:jc w:val="center"/>
+      </w:pPr>
+      <w:r>
+        <w:drawing>
+          <wp:inline xmlns:a="http://schemas.openxmlformats.org/drawingml/2006/main" xmlns:pic="http://schemas.openxmlformats.org/drawingml/2006/picture">
+            <wp:extent cx="5029200" cy="4300330"/>
+            <wp:docPr id="7" name="Picture 7"/>
+            <wp:cNvGraphicFramePr>
+              <a:graphicFrameLocks noChangeAspect="1"/>
+            </wp:cNvGraphicFramePr>
+            <a:graphic>
+              <a:graphicData uri="http://schemas.openxmlformats.org/drawingml/2006/picture">
+                <pic:pic>
+                  <pic:nvPicPr>
+                    <pic:cNvPr id="0" name="nb03_cell12_img1.png"/>
+                    <pic:cNvPicPr/>
+                  </pic:nvPicPr>
+                  <pic:blipFill>
+                    <a:blip r:embed="rId15"/>
+                    <a:stretch>
+                      <a:fillRect/>
+                    </a:stretch>
+                  </pic:blipFill>
+                  <pic:spPr>
+                    <a:xfrm>
+                      <a:off x="0" y="0"/>
+                      <a:ext cx="5029200" cy="4300330"/>
+                    </a:xfrm>
+                    <a:prstGeom prst="rect"/>
+                  </pic:spPr>
+                </pic:pic>
+              </a:graphicData>
+            </a:graphic>
+          </wp:inline>
+        </w:drawing>
+      </w:r>
+    </w:p>
+    <w:p>
+      <w:pPr>
+        <w:jc w:val="center"/>
+      </w:pPr>
+      <w:r>
+        <w:rPr>
+          <w:i/>
+          <w:sz w:val="20"/>
+        </w:rPr>
+        <w:t>Figure 5.1. F-DATA Roofline, per-node operational intensity against per-node performance, for 2,593,124 completed jobs across the six-month sample. The red ceiling combines the compute-bound peak (3.3792 TFLOP/s) and the memory-bound line (operational intensity times 1024 GB/s); the dashed line marks the ridge point at 3.30 FLOP/byte.</w:t>
+      </w:r>
+    </w:p>
+    <w:p>
+      <w:r>
+        <w:t>Classifying each job as compute-bound or memory-bound from its position relative to the ridge point recovered F-DATA's own precomputed pclass label in 99.9931 percent of jobs, which is as close to a direct confirmation of the ceiling's correctness as this data can give.</w:t>
+      </w:r>
+    </w:p>
+    <w:p>
+      <w:r>
+        <w:t>The Roofline ceiling implies a best-case duration for every job: how long it would take running at the fastest rate its own measured operational intensity allows. Evaluated against actual duration on the held-out test split, this scored an R² of -0.326 and a MAPE of 99.93 percent. A naive baseline — each job's own user's median duration over their training-period jobs, falling back to the training-period global median for users with no training history — scored an R² of -0.096 and a MAPE of 15,770 percent on the same split. Both numbers being negative is not a bug in either baseline. The Roofline ceiling assumes a job spends its entire wall-clock duration running at peak achievable rate, with no time lost to I/O, synchronization, or any other non-compute phase, so its predicted durations come out roughly five orders of magnitude below actual ones — a job predicted to finish in a fraction of a second actually running for thousands of seconds is the expected outcome of that assumption, not a sign the ceiling was computed wrong. The naive baseline's enormous MAPE is a known property of that metric when actual values sit close to zero — F-DATA's minimum recorded duration is 1 second — rather than evidence the median itself is a bad estimate; RMSE and R² tell a more usable story for this baseline than MAPE does on its own. Both baselines are exactly the floor the classical ML, deep learning, and hybrid models in later chapters need to clear, and a physics-informed model landing this far below even a naive median is itself worth stating plainly in this thesis rather than only reporting the numbers that make later models look good.</w:t>
+      </w:r>
+    </w:p>
+    <w:p>
+      <w:r>
+        <w:t>PM100 has no FLOP, instruction, or performance-counter field anywhere in its schema — confirmed directly against documentation/job_features.md, not assumed from the absence noted in Section 3.1 — so no Roofline variant is computable there. The plan calls instead for a calibrated power model, fixed in functional form by hardware reasoning (an idle baseline plus a linear contribution per allocated resource) with only the coefficients fit to data.</w:t>
+      </w:r>
+    </w:p>
+    <w:p>
+      <w:r>
+        <w:t>Building that model meant revisiting an assumption from Section 3.2, which described PM100's node_power_consumption as genuinely per-node, in contrast to F-DATA's job-total avgpcon. That assumption does not hold. Dividing each job's mean power by its allocated node count gives a per-node figure that stays close to constant across every node count from 1 to 32: 731.1 watts at 1 node, 720.1 at 2, 717.4 at 4, 701.8 at 8, 677.3 at 16, and 732.1 at 32. A reading that were actually per-node would not need dividing by node count to land in the same range at every scale; the fact that it does only after dividing means the raw field is already summed across every allocated node at each 20-second sample, the same kind of quantity avgpcon turned out to be in F-DATA. This is a correction to Section 3.2's framing, not an extension of it, and the power model below is built for the corrected, job-total interpretation: the idle-power term scales with the number of nodes allocated, rather than being added once per job.</w:t>
+      </w:r>
+    </w:p>
+    <w:p>
+      <w:pPr>
+        <w:jc w:val="center"/>
+      </w:pPr>
+      <w:r>
+        <w:drawing>
+          <wp:inline xmlns:a="http://schemas.openxmlformats.org/drawingml/2006/main" xmlns:pic="http://schemas.openxmlformats.org/drawingml/2006/picture">
+            <wp:extent cx="5029200" cy="3204882"/>
+            <wp:docPr id="8" name="Picture 8"/>
+            <wp:cNvGraphicFramePr>
+              <a:graphicFrameLocks noChangeAspect="1"/>
+            </wp:cNvGraphicFramePr>
+            <a:graphic>
+              <a:graphicData uri="http://schemas.openxmlformats.org/drawingml/2006/picture">
+                <pic:pic>
+                  <pic:nvPicPr>
+                    <pic:cNvPr id="0" name="nb03_cell19_img2.png"/>
+                    <pic:cNvPicPr/>
+                  </pic:nvPicPr>
+                  <pic:blipFill>
+                    <a:blip r:embed="rId16"/>
+                    <a:stretch>
+                      <a:fillRect/>
+                    </a:stretch>
+                  </pic:blipFill>
+                  <pic:spPr>
+                    <a:xfrm>
+                      <a:off x="0" y="0"/>
+                      <a:ext cx="5029200" cy="3204882"/>
+                    </a:xfrm>
+                    <a:prstGeom prst="rect"/>
+                  </pic:spPr>
+                </pic:pic>
+              </a:graphicData>
+            </a:graphic>
+          </wp:inline>
+        </w:drawing>
+      </w:r>
+    </w:p>
+    <w:p>
+      <w:pPr>
+        <w:jc w:val="center"/>
+      </w:pPr>
+      <w:r>
+        <w:rPr>
+          <w:i/>
+          <w:sz w:val="20"/>
+        </w:rPr>
+        <w:t>Figure 5.2. PM100's mean node_power_consumption divided by allocated node count, for jobs at each node count from 1 to 32. A per-node reading would not need this division to stay flat across scales.</w:t>
+      </w:r>
+    </w:p>
+    <w:p>
+      <w:r>
+        <w:t>Before fitting anything, I checked how the model's four predictors — allocated nodes, cores, GPUs, and memory — relate to each other, since Marconi100 assigns cores, GPUs, and memory to a job in close to a fixed ratio per node. They are correlated with each other at 0.85 to 0.97 across every pair. That is worth knowing before looking at the calibrated coefficients below, not after.</w:t>
+      </w:r>
+    </w:p>
+    <w:p>
+      <w:r>
+        <w:t>The model was calibrated by ordinary least squares on the training split only, never touching the test split: an idle-power coefficient of 747.6 watts, 0.256 watts per allocated core, -23.674 watts per allocated GPU, and -0.126 watts per megabyte of allocated memory. The idle-power figure lands close to the 677-732 watt range measured directly above, which is a reasonable plausibility check on the fit. The GPU and memory coefficients coming out negative is physically backwards for resources that should only add to a node's power draw, and the correlation checked above is the direct explanation: with four predictors this closely tied to each other, ordinary least squares has no clean way to attribute the outcome to one of them over its near-duplicate neighbors, even when the resulting fit predicts well overall. I am reporting the coefficients as the fit produced them rather than adjusting them to look more physically sensible, since that would misrepresent what the calibration actually found.</w:t>
+      </w:r>
+    </w:p>
+    <w:p>
+      <w:pPr>
+        <w:jc w:val="center"/>
+      </w:pPr>
+      <w:r>
+        <w:drawing>
+          <wp:inline xmlns:a="http://schemas.openxmlformats.org/drawingml/2006/main" xmlns:pic="http://schemas.openxmlformats.org/drawingml/2006/picture">
+            <wp:extent cx="5029200" cy="3970867"/>
+            <wp:docPr id="9" name="Picture 9"/>
+            <wp:cNvGraphicFramePr>
+              <a:graphicFrameLocks noChangeAspect="1"/>
+            </wp:cNvGraphicFramePr>
+            <a:graphic>
+              <a:graphicData uri="http://schemas.openxmlformats.org/drawingml/2006/picture">
+                <pic:pic>
+                  <pic:nvPicPr>
+                    <pic:cNvPr id="0" name="nb03_cell25_img3.png"/>
+                    <pic:cNvPicPr/>
+                  </pic:nvPicPr>
+                  <pic:blipFill>
+                    <a:blip r:embed="rId17"/>
+                    <a:stretch>
+                      <a:fillRect/>
+                    </a:stretch>
+                  </pic:blipFill>
+                  <pic:spPr>
+                    <a:xfrm>
+                      <a:off x="0" y="0"/>
+                      <a:ext cx="5029200" cy="3970867"/>
+                    </a:xfrm>
+                    <a:prstGeom prst="rect"/>
+                  </pic:spPr>
+                </pic:pic>
+              </a:graphicData>
+            </a:graphic>
+          </wp:inline>
+        </w:drawing>
+      </w:r>
+    </w:p>
+    <w:p>
+      <w:pPr>
+        <w:jc w:val="center"/>
+      </w:pPr>
+      <w:r>
+        <w:rPr>
+          <w:i/>
+          <w:sz w:val="20"/>
+        </w:rPr>
+        <w:t>Figure 5.3. PM100 calibrated power model, predicted against actual mean power on the training-period calibration subset. The dashed line marks perfect prediction.</w:t>
+      </w:r>
+    </w:p>
+    <w:p>
+      <w:r>
+        <w:t>On the held-out test split, the calibrated model scored an R² of 0.910 and a MAPE of 21.82 percent, against the naive per-user-median baseline's R² of 0.096 and MAPE of 49.75 percent on the same jobs — a wide margin in the calibrated model's favor. Read together with the Roofline results above, the two analytical baselines behave very differently relative to their own naive floors: PM100's power target turns out to be far more predictable from allocated resources alone than F-DATA's duration is from a user's own recent history, at least on the six-month and six-consecutive-month slices used here. The model's predictions are trustworthy on this evidence; its individual coefficients, for the reason given above, are not.</w:t>
+      </w:r>
+    </w:p>
+    <w:p>
+      <w:r>
+        <w:t>F-DATA's Roofline baseline and PM100's power model are not directly comparable to each other — different formulas, different physical quantities, and different targets, execution time against power. Any table in this thesis that places both side by side, including the one notebook 03 builds for its own recordkeeping, exists for convenience of layout, not as a claim that the two numbers mean the same thing.</w:t>
+      </w:r>
+    </w:p>
+    <w:p>
+      <w:r>
+        <w:t>Three things are deferred past this notebook. The Roofline analysis above covers six of F-DATA's 38 months; the full-scale run is left for a later notebook, consistent with the dev-scale approach used throughout this chapter. The rolling-window temporal-drift check across F-DATA's full span, separate from the single chronological split used here, has not been run. And both baselines built here — Roofline, the naive median, and the calibrated power model — are meant to be reused in the full evaluation sweep planned for notebook 08, sitting in the same comparison tables as the random forest, gradient-boosted tree, feedforward, recurrent, and hybrid models covered in later chapters.</w:t>
+      </w:r>
+    </w:p>
     <w:sectPr>
       <w:pgSz w:w="12240" w:h="15840"/>
       <w:pgMar w:top="1440" w:right="1800" w:bottom="1440" w:left="1800" w:header="720" w:footer="720" w:gutter="0"/>

</xml_diff>

<commit_message>
Add missing target-distribution figures, rolling-stat coverage, and a Decision #19 callback to the thesis draft
Three fixes from vetting notebooks 01-03 against the draft:
- Section 3.2: added the 5 missing raw-vs-log1p target-distribution
  figures (F-DATA memory/power, PM100 execution time/memory/power) so
  all six targets have supporting figures, not just F-DATA's execution
  time. Chapter 3 figures renumbered 3.5-3.11 accordingly; 3.1-3.4
  unchanged.
- Section 3.3: added the rolling-stat feature's dev-sample coverage
  (93.8% F-DATA, 94.1% PM100), flagged as provisional per notebook 02's
  own caveat about sparse history at this scale.
- Section 5.4: added a one-sentence callback tying its Decision #19
  sanity-check assertions back to the discipline established in 3.3.
</commit_message>
<xml_diff>
--- a/writing/thesis_draft_notes.docx
+++ b/writing/thesis_draft_notes.docx
@@ -122,6 +122,266 @@
     </w:p>
     <w:p>
       <w:r>
+        <w:t>The same pattern holds for the other five targets. F-DATA's memory and power, and all three of PM100's targets, show the same near-zero-dominated raw histogram spread into something usable once log1p-transformed.</w:t>
+      </w:r>
+    </w:p>
+    <w:p>
+      <w:pPr>
+        <w:jc w:val="center"/>
+      </w:pPr>
+      <w:r>
+        <w:drawing>
+          <wp:inline xmlns:a="http://schemas.openxmlformats.org/drawingml/2006/main" xmlns:pic="http://schemas.openxmlformats.org/drawingml/2006/picture">
+            <wp:extent cx="5029200" cy="1981200"/>
+            <wp:docPr id="2" name="Picture 2"/>
+            <wp:cNvGraphicFramePr>
+              <a:graphicFrameLocks noChangeAspect="1"/>
+            </wp:cNvGraphicFramePr>
+            <a:graphic>
+              <a:graphicData uri="http://schemas.openxmlformats.org/drawingml/2006/picture">
+                <pic:pic>
+                  <pic:nvPicPr>
+                    <pic:cNvPr id="0" name="nb01_cell15_img2.png"/>
+                    <pic:cNvPicPr/>
+                  </pic:nvPicPr>
+                  <pic:blipFill>
+                    <a:blip r:embed="rId10"/>
+                    <a:stretch>
+                      <a:fillRect/>
+                    </a:stretch>
+                  </pic:blipFill>
+                  <pic:spPr>
+                    <a:xfrm>
+                      <a:off x="0" y="0"/>
+                      <a:ext cx="5029200" cy="1981200"/>
+                    </a:xfrm>
+                    <a:prstGeom prst="rect"/>
+                  </pic:spPr>
+                </pic:pic>
+              </a:graphicData>
+            </a:graphic>
+          </wp:inline>
+        </w:drawing>
+      </w:r>
+    </w:p>
+    <w:p>
+      <w:pPr>
+        <w:jc w:val="center"/>
+      </w:pPr>
+      <w:r>
+        <w:rPr>
+          <w:i/>
+          <w:sz w:val="20"/>
+        </w:rPr>
+        <w:t>Figure 3.5. F-DATA memory (mmszu), raw versus log1p-transformed.</w:t>
+      </w:r>
+    </w:p>
+    <w:p>
+      <w:pPr>
+        <w:jc w:val="center"/>
+      </w:pPr>
+      <w:r>
+        <w:drawing>
+          <wp:inline xmlns:a="http://schemas.openxmlformats.org/drawingml/2006/main" xmlns:pic="http://schemas.openxmlformats.org/drawingml/2006/picture">
+            <wp:extent cx="5029200" cy="1983203"/>
+            <wp:docPr id="3" name="Picture 3"/>
+            <wp:cNvGraphicFramePr>
+              <a:graphicFrameLocks noChangeAspect="1"/>
+            </wp:cNvGraphicFramePr>
+            <a:graphic>
+              <a:graphicData uri="http://schemas.openxmlformats.org/drawingml/2006/picture">
+                <pic:pic>
+                  <pic:nvPicPr>
+                    <pic:cNvPr id="0" name="nb01_cell15_img3.png"/>
+                    <pic:cNvPicPr/>
+                  </pic:nvPicPr>
+                  <pic:blipFill>
+                    <a:blip r:embed="rId11"/>
+                    <a:stretch>
+                      <a:fillRect/>
+                    </a:stretch>
+                  </pic:blipFill>
+                  <pic:spPr>
+                    <a:xfrm>
+                      <a:off x="0" y="0"/>
+                      <a:ext cx="5029200" cy="1983203"/>
+                    </a:xfrm>
+                    <a:prstGeom prst="rect"/>
+                  </pic:spPr>
+                </pic:pic>
+              </a:graphicData>
+            </a:graphic>
+          </wp:inline>
+        </w:drawing>
+      </w:r>
+    </w:p>
+    <w:p>
+      <w:pPr>
+        <w:jc w:val="center"/>
+      </w:pPr>
+      <w:r>
+        <w:rPr>
+          <w:i/>
+          <w:sz w:val="20"/>
+        </w:rPr>
+        <w:t>Figure 3.6. F-DATA power (avgpcon), raw versus log1p-transformed.</w:t>
+      </w:r>
+    </w:p>
+    <w:p>
+      <w:pPr>
+        <w:jc w:val="center"/>
+      </w:pPr>
+      <w:r>
+        <w:drawing>
+          <wp:inline xmlns:a="http://schemas.openxmlformats.org/drawingml/2006/main" xmlns:pic="http://schemas.openxmlformats.org/drawingml/2006/picture">
+            <wp:extent cx="5029200" cy="1981200"/>
+            <wp:docPr id="4" name="Picture 4"/>
+            <wp:cNvGraphicFramePr>
+              <a:graphicFrameLocks noChangeAspect="1"/>
+            </wp:cNvGraphicFramePr>
+            <a:graphic>
+              <a:graphicData uri="http://schemas.openxmlformats.org/drawingml/2006/picture">
+                <pic:pic>
+                  <pic:nvPicPr>
+                    <pic:cNvPr id="0" name="nb01_cell16_img4.png"/>
+                    <pic:cNvPicPr/>
+                  </pic:nvPicPr>
+                  <pic:blipFill>
+                    <a:blip r:embed="rId12"/>
+                    <a:stretch>
+                      <a:fillRect/>
+                    </a:stretch>
+                  </pic:blipFill>
+                  <pic:spPr>
+                    <a:xfrm>
+                      <a:off x="0" y="0"/>
+                      <a:ext cx="5029200" cy="1981200"/>
+                    </a:xfrm>
+                    <a:prstGeom prst="rect"/>
+                  </pic:spPr>
+                </pic:pic>
+              </a:graphicData>
+            </a:graphic>
+          </wp:inline>
+        </w:drawing>
+      </w:r>
+    </w:p>
+    <w:p>
+      <w:pPr>
+        <w:jc w:val="center"/>
+      </w:pPr>
+      <w:r>
+        <w:rPr>
+          <w:i/>
+          <w:sz w:val="20"/>
+        </w:rPr>
+        <w:t>Figure 3.7. PM100 execution time (run_time), raw versus log1p-transformed.</w:t>
+      </w:r>
+    </w:p>
+    <w:p>
+      <w:pPr>
+        <w:jc w:val="center"/>
+      </w:pPr>
+      <w:r>
+        <w:drawing>
+          <wp:inline xmlns:a="http://schemas.openxmlformats.org/drawingml/2006/main" xmlns:pic="http://schemas.openxmlformats.org/drawingml/2006/picture">
+            <wp:extent cx="5029200" cy="1981200"/>
+            <wp:docPr id="5" name="Picture 5"/>
+            <wp:cNvGraphicFramePr>
+              <a:graphicFrameLocks noChangeAspect="1"/>
+            </wp:cNvGraphicFramePr>
+            <a:graphic>
+              <a:graphicData uri="http://schemas.openxmlformats.org/drawingml/2006/picture">
+                <pic:pic>
+                  <pic:nvPicPr>
+                    <pic:cNvPr id="0" name="nb01_cell16_img5.png"/>
+                    <pic:cNvPicPr/>
+                  </pic:nvPicPr>
+                  <pic:blipFill>
+                    <a:blip r:embed="rId13"/>
+                    <a:stretch>
+                      <a:fillRect/>
+                    </a:stretch>
+                  </pic:blipFill>
+                  <pic:spPr>
+                    <a:xfrm>
+                      <a:off x="0" y="0"/>
+                      <a:ext cx="5029200" cy="1981200"/>
+                    </a:xfrm>
+                    <a:prstGeom prst="rect"/>
+                  </pic:spPr>
+                </pic:pic>
+              </a:graphicData>
+            </a:graphic>
+          </wp:inline>
+        </w:drawing>
+      </w:r>
+    </w:p>
+    <w:p>
+      <w:pPr>
+        <w:jc w:val="center"/>
+      </w:pPr>
+      <w:r>
+        <w:rPr>
+          <w:i/>
+          <w:sz w:val="20"/>
+        </w:rPr>
+        <w:t>Figure 3.8. PM100 memory (mem_alloc), raw versus log1p-transformed.</w:t>
+      </w:r>
+    </w:p>
+    <w:p>
+      <w:pPr>
+        <w:jc w:val="center"/>
+      </w:pPr>
+      <w:r>
+        <w:drawing>
+          <wp:inline xmlns:a="http://schemas.openxmlformats.org/drawingml/2006/main" xmlns:pic="http://schemas.openxmlformats.org/drawingml/2006/picture">
+            <wp:extent cx="5029200" cy="1981200"/>
+            <wp:docPr id="6" name="Picture 6"/>
+            <wp:cNvGraphicFramePr>
+              <a:graphicFrameLocks noChangeAspect="1"/>
+            </wp:cNvGraphicFramePr>
+            <a:graphic>
+              <a:graphicData uri="http://schemas.openxmlformats.org/drawingml/2006/picture">
+                <pic:pic>
+                  <pic:nvPicPr>
+                    <pic:cNvPr id="0" name="nb01_cell16_img6.png"/>
+                    <pic:cNvPicPr/>
+                  </pic:nvPicPr>
+                  <pic:blipFill>
+                    <a:blip r:embed="rId14"/>
+                    <a:stretch>
+                      <a:fillRect/>
+                    </a:stretch>
+                  </pic:blipFill>
+                  <pic:spPr>
+                    <a:xfrm>
+                      <a:off x="0" y="0"/>
+                      <a:ext cx="5029200" cy="1981200"/>
+                    </a:xfrm>
+                    <a:prstGeom prst="rect"/>
+                  </pic:spPr>
+                </pic:pic>
+              </a:graphicData>
+            </a:graphic>
+          </wp:inline>
+        </w:drawing>
+      </w:r>
+    </w:p>
+    <w:p>
+      <w:pPr>
+        <w:jc w:val="center"/>
+      </w:pPr>
+      <w:r>
+        <w:rPr>
+          <w:i/>
+          <w:sz w:val="20"/>
+        </w:rPr>
+        <w:t>Figure 3.9. PM100 power (node_power_consumption), raw versus log1p-transformed.</w:t>
+      </w:r>
+    </w:p>
+    <w:p>
+      <w:r>
         <w:t>Only one month of F-DATA was available when this pipeline was first built; all 38 months were obtained shortly afterward. The two job-count-over-time plots below cover the full range now available for both datasets and will matter directly in Chapter 4, where the chronological train/test split depends on there being enough time span to split meaningfully.</w:t>
       </w:r>
     </w:p>
@@ -133,7 +393,7 @@
         <w:drawing>
           <wp:inline xmlns:a="http://schemas.openxmlformats.org/drawingml/2006/main" xmlns:pic="http://schemas.openxmlformats.org/drawingml/2006/picture">
             <wp:extent cx="5029200" cy="1708704"/>
-            <wp:docPr id="2" name="Picture 2"/>
+            <wp:docPr id="7" name="Picture 7"/>
             <wp:cNvGraphicFramePr>
               <a:graphicFrameLocks noChangeAspect="1"/>
             </wp:cNvGraphicFramePr>
@@ -145,7 +405,7 @@
                     <pic:cNvPicPr/>
                   </pic:nvPicPr>
                   <pic:blipFill>
-                    <a:blip r:embed="rId10"/>
+                    <a:blip r:embed="rId15"/>
                     <a:stretch>
                       <a:fillRect/>
                     </a:stretch>
@@ -173,7 +433,7 @@
           <w:i/>
           <w:sz w:val="20"/>
         </w:rPr>
-        <w:t>Figure 3.5. F-DATA jobs per day across the sampled files.</w:t>
+        <w:t>Figure 3.10. F-DATA jobs per day across the sampled files.</w:t>
       </w:r>
     </w:p>
     <w:p>
@@ -184,7 +444,7 @@
         <w:drawing>
           <wp:inline xmlns:a="http://schemas.openxmlformats.org/drawingml/2006/main" xmlns:pic="http://schemas.openxmlformats.org/drawingml/2006/picture">
             <wp:extent cx="5029200" cy="1708704"/>
-            <wp:docPr id="3" name="Picture 3"/>
+            <wp:docPr id="8" name="Picture 8"/>
             <wp:cNvGraphicFramePr>
               <a:graphicFrameLocks noChangeAspect="1"/>
             </wp:cNvGraphicFramePr>
@@ -196,7 +456,7 @@
                     <pic:cNvPicPr/>
                   </pic:nvPicPr>
                   <pic:blipFill>
-                    <a:blip r:embed="rId11"/>
+                    <a:blip r:embed="rId16"/>
                     <a:stretch>
                       <a:fillRect/>
                     </a:stretch>
@@ -224,7 +484,7 @@
           <w:i/>
           <w:sz w:val="20"/>
         </w:rPr>
-        <w:t>Figure 3.6. PM100 jobs per day across its full six-month span.</w:t>
+        <w:t>Figure 3.11. PM100 jobs per day across its full six-month span.</w:t>
       </w:r>
     </w:p>
     <w:p>
@@ -242,7 +502,7 @@
     </w:p>
     <w:p>
       <w:r>
-        <w:t>I split every feature into two tiers to make this distinction impossible to blur by accident. Tier A holds only what is known at submission time: requested cores, nodes, and memory; queue and priority; requested wall time; an anonymized job-name embedding; and, for F-DATA, a rolling average of each user's recent job durations computed using only jobs strictly before the current one. Tier B holds everything measured during or after execution — allocated versus used resources, exit codes, the hardware counters, and the power fields. Tier A is what a scheduler could actually use to predict a job's behavior before running it; Tier B exists for characterizing what happened after the fact and for the residual-learning step of the hybrid model described in Chapter 4. The two tiers are built by separate functions rather than one function with a flag, specifically so that mixing them requires deliberately writing code to do it. An assertion checks for column overlap between the two lists every time the module loads, and a second assertion re-checks after every transformation step in the feature pipeline, not just once at the start.</w:t>
+        <w:t>I split every feature into two tiers to make this distinction impossible to blur by accident. Tier A holds only what is known at submission time: requested cores, nodes, and memory; queue and priority; requested wall time; an anonymized job-name embedding; and, for F-DATA, a rolling average of each user's recent job durations computed using only jobs strictly before the current one. On the current dev sample, that rolling average was populated for 4,426 of 4,721 F-DATA jobs (93.8 percent) and 3,717 of 3,952 PM100 jobs (94.1 percent) — high coverage at this scale, but notebook 02 flags it as provisional rather than final: with only a handful of scattered months loaded so far, many of these rolling averages rest on very few prior jobs per user rather than a full window, and both the coverage rate and the values themselves are expected to firm up once more of the dataset is loaded. Tier B holds everything measured during or after execution — allocated versus used resources, exit codes, the hardware counters, and the power fields. Tier A is what a scheduler could actually use to predict a job's behavior before running it; Tier B exists for characterizing what happened after the fact and for the residual-learning step of the hybrid model described in Chapter 4. The two tiers are built by separate functions rather than one function with a flag, specifically so that mixing them requires deliberately writing code to do it. An assertion checks for column overlap between the two lists every time the module loads, and a second assertion re-checks after every transformation step in the feature pipeline, not just once at the start.</w:t>
       </w:r>
     </w:p>
     <w:p>
@@ -271,7 +531,7 @@
         <w:drawing>
           <wp:inline xmlns:a="http://schemas.openxmlformats.org/drawingml/2006/main" xmlns:pic="http://schemas.openxmlformats.org/drawingml/2006/picture">
             <wp:extent cx="5029200" cy="3678072"/>
-            <wp:docPr id="4" name="Picture 4"/>
+            <wp:docPr id="9" name="Picture 9"/>
             <wp:cNvGraphicFramePr>
               <a:graphicFrameLocks noChangeAspect="1"/>
             </wp:cNvGraphicFramePr>
@@ -283,7 +543,7 @@
                     <pic:cNvPicPr/>
                   </pic:nvPicPr>
                   <pic:blipFill>
-                    <a:blip r:embed="rId12"/>
+                    <a:blip r:embed="rId17"/>
                     <a:stretch>
                       <a:fillRect/>
                     </a:stretch>
@@ -350,7 +610,7 @@
         <w:drawing>
           <wp:inline xmlns:a="http://schemas.openxmlformats.org/drawingml/2006/main" xmlns:pic="http://schemas.openxmlformats.org/drawingml/2006/picture">
             <wp:extent cx="5029200" cy="1339995"/>
-            <wp:docPr id="5" name="Picture 5"/>
+            <wp:docPr id="10" name="Picture 10"/>
             <wp:cNvGraphicFramePr>
               <a:graphicFrameLocks noChangeAspect="1"/>
             </wp:cNvGraphicFramePr>
@@ -362,7 +622,7 @@
                     <pic:cNvPicPr/>
                   </pic:nvPicPr>
                   <pic:blipFill>
-                    <a:blip r:embed="rId13"/>
+                    <a:blip r:embed="rId18"/>
                     <a:stretch>
                       <a:fillRect/>
                     </a:stretch>
@@ -411,7 +671,7 @@
         <w:drawing>
           <wp:inline xmlns:a="http://schemas.openxmlformats.org/drawingml/2006/main" xmlns:pic="http://schemas.openxmlformats.org/drawingml/2006/picture">
             <wp:extent cx="5029200" cy="2501770"/>
-            <wp:docPr id="6" name="Picture 6"/>
+            <wp:docPr id="11" name="Picture 11"/>
             <wp:cNvGraphicFramePr>
               <a:graphicFrameLocks noChangeAspect="1"/>
             </wp:cNvGraphicFramePr>
@@ -423,7 +683,7 @@
                     <pic:cNvPicPr/>
                   </pic:nvPicPr>
                   <pic:blipFill>
-                    <a:blip r:embed="rId14"/>
+                    <a:blip r:embed="rId19"/>
                     <a:stretch>
                       <a:fillRect/>
                     </a:stretch>
@@ -585,7 +845,7 @@
         <w:drawing>
           <wp:inline xmlns:a="http://schemas.openxmlformats.org/drawingml/2006/main" xmlns:pic="http://schemas.openxmlformats.org/drawingml/2006/picture">
             <wp:extent cx="5029200" cy="4300330"/>
-            <wp:docPr id="7" name="Picture 7"/>
+            <wp:docPr id="12" name="Picture 12"/>
             <wp:cNvGraphicFramePr>
               <a:graphicFrameLocks noChangeAspect="1"/>
             </wp:cNvGraphicFramePr>
@@ -597,7 +857,7 @@
                     <pic:cNvPicPr/>
                   </pic:nvPicPr>
                   <pic:blipFill>
-                    <a:blip r:embed="rId15"/>
+                    <a:blip r:embed="rId20"/>
                     <a:stretch>
                       <a:fillRect/>
                     </a:stretch>
@@ -656,7 +916,7 @@
         <w:drawing>
           <wp:inline xmlns:a="http://schemas.openxmlformats.org/drawingml/2006/main" xmlns:pic="http://schemas.openxmlformats.org/drawingml/2006/picture">
             <wp:extent cx="5029200" cy="3204882"/>
-            <wp:docPr id="8" name="Picture 8"/>
+            <wp:docPr id="13" name="Picture 13"/>
             <wp:cNvGraphicFramePr>
               <a:graphicFrameLocks noChangeAspect="1"/>
             </wp:cNvGraphicFramePr>
@@ -668,7 +928,7 @@
                     <pic:cNvPicPr/>
                   </pic:nvPicPr>
                   <pic:blipFill>
-                    <a:blip r:embed="rId16"/>
+                    <a:blip r:embed="rId21"/>
                     <a:stretch>
                       <a:fillRect/>
                     </a:stretch>
@@ -717,7 +977,7 @@
         <w:drawing>
           <wp:inline xmlns:a="http://schemas.openxmlformats.org/drawingml/2006/main" xmlns:pic="http://schemas.openxmlformats.org/drawingml/2006/picture">
             <wp:extent cx="5029200" cy="3970867"/>
-            <wp:docPr id="9" name="Picture 9"/>
+            <wp:docPr id="14" name="Picture 14"/>
             <wp:cNvGraphicFramePr>
               <a:graphicFrameLocks noChangeAspect="1"/>
             </wp:cNvGraphicFramePr>
@@ -729,7 +989,7 @@
                     <pic:cNvPicPr/>
                   </pic:nvPicPr>
                   <pic:blipFill>
-                    <a:blip r:embed="rId17"/>
+                    <a:blip r:embed="rId22"/>
                     <a:stretch>
                       <a:fillRect/>
                     </a:stretch>
@@ -768,6 +1028,11 @@
     <w:p>
       <w:r>
         <w:t>F-DATA's Roofline baseline and PM100's power model are not directly comparable to each other — different formulas, different physical quantities, and different targets, execution time against power. Any table in this thesis that places both side by side, including the one notebook 03 builds for its own recordkeeping, exists for convenience of layout, not as a claim that the two numbers mean the same thing.</w:t>
+      </w:r>
+    </w:p>
+    <w:p>
+      <w:r>
+        <w:t>Section 3.3 called re-checking assertions after every transformation step a deliberate discipline rather than a formality, and this notebook kept it up: opint's non-negativity and finiteness, the Roofline ceiling never exceeding the compute-bound peak, positive predicted durations, finite calibration coefficients, the log1p/expm1 round-trip, and no leakage across the chronological split all passed before any number reported above was trusted.</w:t>
       </w:r>
     </w:p>
     <w:p>

</xml_diff>

<commit_message>
Add Section 5.5 Microbenchmark Validation, documenting notebook 04
Covers the RTX 3090 setup, the explicit rationale for substituting four
PyTorch kernels for Rodinia/NPB (validates the Roofline construction
itself, not F-DATA's workload mix — grounded in Konstantinidis et al.
2017's own microbenchmark logic), the measured-Roofline classification
results (a stronger validation than notebook 03's, since these kernels'
true regime is known in advance rather than only cross-checked against
a dataset's own label), and the L2-cache-effect finding written up as a
real methodology point tying back to Yang et al. 2019's Hierarchical
Roofline. Figures 5.4-5.5 extracted from the executed notebook's real
outputs. Chapters 3 and 5.1-5.4 left untouched.
</commit_message>
<xml_diff>
--- a/writing/thesis_draft_notes.docx
+++ b/writing/thesis_draft_notes.docx
@@ -1040,6 +1040,156 @@
         <w:t>Three things are deferred past this notebook. The Roofline analysis above covers six of F-DATA's 38 months; the full-scale run is left for a later notebook, consistent with the dev-scale approach used throughout this chapter. The rolling-window temporal-drift check across F-DATA's full span, separate from the single chronological split used here, has not been run. And both baselines built here — Roofline, the naive median, and the calibrated power model — are meant to be reused in the full evaluation sweep planned for notebook 08, sitting in the same comparison tables as the random forest, gradient-boosted tree, feedforward, recurrent, and hybrid models covered in later chapters.</w:t>
       </w:r>
     </w:p>
+    <w:p>
+      <w:pPr>
+        <w:pStyle w:val="Heading2"/>
+      </w:pPr>
+      <w:r>
+        <w:t>5.5 Microbenchmark Validation</w:t>
+      </w:r>
+    </w:p>
+    <w:p>
+      <w:r>
+        <w:t>Decision #16 calls for a small, contained side-study alongside the two analytical baselines in Section 5.4: run a handful of GPU kernels locally and check the Roofline construction against real, directly-timed hardware behavior, rather than relying only on a dataset's self-reported counters. Notebook 04 is that side-study, and it doesn't feed into F-DATA or PM100 at all — its only job is to check whether the ceiling formula and the compute/memory-bound classification logic behind notebook 03's F-DATA Roofline actually recover the right answer when the right answer is known in advance.</w:t>
+      </w:r>
+    </w:p>
+    <w:p>
+      <w:r>
+        <w:t>It runs on this workstation's own RTX 3090, confirmed directly rather than assumed: a GA102 die, 82 streaming multiprocessors, compute capability 8.6, 25.29 gigabytes of memory. Published specs put its double-precision peak at 0.556 teraFLOP/s and its single-precision peak at 35.58 teraFLOP/s — consumer Ampere runs FP64 at 1/64 the FP32 rate, a restriction a datacenter part like the A100 doesn't share — and its memory bandwidth at 936.2 gigabytes per second across a 384-bit GDDR6X bus.</w:t>
+      </w:r>
+    </w:p>
+    <w:p>
+      <w:r>
+        <w:t>The plan named NAS Parallel Benchmarks or Rodinia's kernel suite as the source material, following Konstantinidis et al. 2017's microbenchmark-based Roofline approach. Neither suite was actually compiled and run here; four standard operations implemented directly in PyTorch substitute for them — vector_add (SAXPY/DAXPY), dot_product, gemv (matrix-vector multiply), and gemm (matrix-matrix multiply) — chosen to span the same low-to-high arithmetic-intensity range Rodinia's kernels do, in less time than standing up an external C/CUDA build. None of these four resemble anything in F-DATA's actual job mix, and that's not an oversight: this notebook validates the Roofline construction itself, not F-DATA's workload characteristics, and validating a construction requires kernels whose FLOP count and byte count are known exactly, so their true compute- or memory-bound regime is known in advance. F-DATA's own jobs offer no such independent ground truth — only the dataset's own precomputed pclass label, which risks confirming the same method it's meant to check rather than testing it against something external. Konstantinidis et al. 2017's own approach uses this same logic: synthetic, controlled kernels trace a GPU's achievable-performance curve independent of whatever workload eventually runs against it. Dense linear algebra isn't an arbitrary stand-in either — GEMM and GEMV underlie a large share of real scientific computing — but no claim is made that these four kernels reproduce F-DATA's actual jobs; that would need profiling real F-DATA-representative application code, which is out of scope here.</w:t>
+      </w:r>
+    </w:p>
+    <w:p>
+      <w:r>
+        <w:t>Each kernel ran across several problem sizes, in both FP32 and FP64, timed with CUDA events rather than wall-clock time so host-side Python overhead around the kernel launch wouldn't be included: five warmup calls discarded, then twenty further calls averaged.</w:t>
+      </w:r>
+    </w:p>
+    <w:p>
+      <w:r>
+        <w:t>Unlike F-DATA, these kernels have a regime known in advance by construction: vector_add and dot_product are memory-bound at any problem size, and gemm should move toward compute-bound as the matrix size grows, since its FLOPs scale with the cube of the dimension against memory traffic that only scales with the square. The classification logic recovered exactly that in every run — vector_add and dot_product classified memory-bound in 8 of 8 runs at both precisions, and the largest gemm (8192×8192) classified compute-bound, reaching 75.8 percent of the FP32 peak and 100.0 percent of the FP64 peak. That FP64 figure isn't a typo: the crippled consumer FP64 rate is low enough that a modestly sized GEMM saturates it easily. Because these kernels' true regime is known independently rather than only cross-checked against a dataset's own label, this is a stronger validation of the Roofline construction than notebook 03's 99.9931 percent pclass agreement was.</w:t>
+      </w:r>
+    </w:p>
+    <w:p>
+      <w:pPr>
+        <w:jc w:val="center"/>
+      </w:pPr>
+      <w:r>
+        <w:drawing>
+          <wp:inline xmlns:a="http://schemas.openxmlformats.org/drawingml/2006/main" xmlns:pic="http://schemas.openxmlformats.org/drawingml/2006/picture">
+            <wp:extent cx="5029200" cy="4300330"/>
+            <wp:docPr id="15" name="Picture 15"/>
+            <wp:cNvGraphicFramePr>
+              <a:graphicFrameLocks noChangeAspect="1"/>
+            </wp:cNvGraphicFramePr>
+            <a:graphic>
+              <a:graphicData uri="http://schemas.openxmlformats.org/drawingml/2006/picture">
+                <pic:pic>
+                  <pic:nvPicPr>
+                    <pic:cNvPr id="0" name="nb04_cell10_img1.png"/>
+                    <pic:cNvPicPr/>
+                  </pic:nvPicPr>
+                  <pic:blipFill>
+                    <a:blip r:embed="rId23"/>
+                    <a:stretch>
+                      <a:fillRect/>
+                    </a:stretch>
+                  </pic:blipFill>
+                  <pic:spPr>
+                    <a:xfrm>
+                      <a:off x="0" y="0"/>
+                      <a:ext cx="5029200" cy="4300330"/>
+                    </a:xfrm>
+                    <a:prstGeom prst="rect"/>
+                  </pic:spPr>
+                </pic:pic>
+              </a:graphicData>
+            </a:graphic>
+          </wp:inline>
+        </w:drawing>
+      </w:r>
+    </w:p>
+    <w:p>
+      <w:pPr>
+        <w:jc w:val="center"/>
+      </w:pPr>
+      <w:r>
+        <w:rPr>
+          <w:i/>
+          <w:sz w:val="20"/>
+        </w:rPr>
+        <w:t>Figure 5.4. RTX 3090 measured Roofline, FP32. Achieved performance for all four kernels across their tested problem sizes, against the 35.58 TFLOP/s compute-bound ceiling and the 936.2 GB/s memory-bound line.</w:t>
+      </w:r>
+    </w:p>
+    <w:p>
+      <w:pPr>
+        <w:jc w:val="center"/>
+      </w:pPr>
+      <w:r>
+        <w:drawing>
+          <wp:inline xmlns:a="http://schemas.openxmlformats.org/drawingml/2006/main" xmlns:pic="http://schemas.openxmlformats.org/drawingml/2006/picture">
+            <wp:extent cx="5029200" cy="4306572"/>
+            <wp:docPr id="16" name="Picture 16"/>
+            <wp:cNvGraphicFramePr>
+              <a:graphicFrameLocks noChangeAspect="1"/>
+            </wp:cNvGraphicFramePr>
+            <a:graphic>
+              <a:graphicData uri="http://schemas.openxmlformats.org/drawingml/2006/picture">
+                <pic:pic>
+                  <pic:nvPicPr>
+                    <pic:cNvPr id="0" name="nb04_cell11_img2.png"/>
+                    <pic:cNvPicPr/>
+                  </pic:nvPicPr>
+                  <pic:blipFill>
+                    <a:blip r:embed="rId24"/>
+                    <a:stretch>
+                      <a:fillRect/>
+                    </a:stretch>
+                  </pic:blipFill>
+                  <pic:spPr>
+                    <a:xfrm>
+                      <a:off x="0" y="0"/>
+                      <a:ext cx="5029200" cy="4306572"/>
+                    </a:xfrm>
+                    <a:prstGeom prst="rect"/>
+                  </pic:spPr>
+                </pic:pic>
+              </a:graphicData>
+            </a:graphic>
+          </wp:inline>
+        </w:drawing>
+      </w:r>
+    </w:p>
+    <w:p>
+      <w:pPr>
+        <w:jc w:val="center"/>
+      </w:pPr>
+      <w:r>
+        <w:rPr>
+          <w:i/>
+          <w:sz w:val="20"/>
+        </w:rPr>
+        <w:t>Figure 5.5. RTX 3090 measured Roofline, FP64. Same construction as Figure 5.4, against FP64's much lower 0.556 TFLOP/s compute-bound ceiling — GEMM saturates it at far smaller matrix sizes than in FP32.</w:t>
+      </w:r>
+    </w:p>
+    <w:p>
+      <w:r>
+        <w:t>Building this validation surfaced a real finding along the way, not a bug. The first version of the sanity checks failed: vector_add at the smallest FP32 size (1,000,000 elements, an 8-megabyte working set across its two arrays) measured 124.6 percent of the RTX 3090's 936.2 gigabyte-per-second DRAM peak. The same kernel at 2,000,000 elements (16 megabytes) and above measured a normal 83 to 90 percent, so the excess was confined to a single point. The explanation is the GPU's memory hierarchy, not measurement error: the timing harness calls the same kernel on the same tensors twenty times in a row, and GA102's 6-megabyte L2 cache is large enough to serve a meaningful share of an 8-megabyte working set's repeated accesses, so the achieved rate reflects a blend of cache and DRAM bandwidth rather than DRAM alone. dot_product at the identical working set didn't show the same excess (54.8 percent of peak), which ruled out working-set size alone as the explanation — the specific memory-access pattern matters too, and a reduction kernel apparently doesn't benefit from repeated-call cache residency the way a straightforward elementwise write does. I fixed this by adding a working-set-size field to each kernel result and excluding rows within twice the L2 cache size from the DRAM-bandwidth check, a carve-out justified by the specific row it was built to explain rather than a tolerance loosened until the assertion stopped failing.</w:t>
+      </w:r>
+    </w:p>
+    <w:p>
+      <w:r>
+        <w:t>This ties directly back to why Yang et al. 2019's Hierarchical Roofline, cited for F-DATA's methodology in the previous section, models multiple bandwidth levels — L1, L2, device memory, system memory — rather than a single DRAM figure. A roofline built against DRAM bandwidth alone is exactly the kind of model a small, cache-friendly problem can appear to violate, when what actually happened is the problem ran against a faster level of the memory hierarchy instead. F-DATA's own Roofline used a single measured bandwidth field and couldn't have caught this the way a controlled microbenchmark can — worth remembering when reading Section 5.4's ceiling as if it captured the whole hierarchy, since it doesn't.</w:t>
+      </w:r>
+    </w:p>
+    <w:p>
+      <w:r>
+        <w:t>The scope limitation from Decision #16 applies exactly as it does elsewhere in this thesis: this workstation's RTX 3090 is neither Fugaku's A64FX nor Marconi100's V100s, so nothing here is a hardware-matched ceiling for either dataset. What it validates is the construction — does a real, measured achieved-performance-versus-intensity relationship take the shape the Roofline theory predicts, on hardware where the correct answer is known in advance. This notebook is self-contained and doesn't feed into any other notebook; per the plan's descope ordering it was flagged as the easiest clean cut if the timeline runs short, since dropping it wouldn't block anything else, but it stayed in scope here.</w:t>
+      </w:r>
+    </w:p>
     <w:sectPr>
       <w:pgSz w:w="12240" w:h="15840"/>
       <w:pgMar w:top="1440" w:right="1800" w:bottom="1440" w:left="1800" w:header="720" w:footer="720" w:gutter="0"/>

</xml_diff>

<commit_message>
Remove internal-artifact references from the thesis draft prose
The docx is the only artifact an outside reader ever sees -
EXPERIMENT_TRACKER.md, WRITING_TRACKER.md, and the numbered-Decision
conceptualization plan are personal scratch notes that never ship.
Fixed 5 places where the draft leaked references to them instead of
stating the reasoning directly: "Decision #16 calls for..." (twice, in
5.5), "the plan called for..." (3.4), "the plan calls for..." (5.4),
"The plan calls instead for..." (5.4), and the document's own top-level
intro paragraph naming WRITING_TRACKER.md. Rewrote each to be
self-contained. No content or figures changed, wording only.
</commit_message>
<xml_diff>
--- a/writing/thesis_draft_notes.docx
+++ b/writing/thesis_draft_notes.docx
@@ -12,7 +12,7 @@
     </w:p>
     <w:p>
       <w:r>
-        <w:t>This document collects the writing-ready material produced while building the data pipeline for this thesis. It is organized by the chapter each section is expected to land in, following the structure recorded in WRITING_TRACKER.md. None of this is final prose — line numbers, wording, and even section order will change once the surrounding chapters exist — but the substance, the numbers, and the reasoning behind each decision are accurate as of this draft and worth keeping rather than reconstructing later from memory.</w:t>
+        <w:t>This document collects the writing-ready material produced while building the data pipeline for this thesis, organized by the chapter each section is expected to land in. None of this is final prose — line numbers, wording, and even section order will change once the surrounding chapters exist — but the substance, the numbers, and the reasoning behind each decision are accurate as of this draft and worth keeping rather than reconstructing later from memory.</w:t>
       </w:r>
     </w:p>
     <w:p>
@@ -515,7 +515,7 @@
     </w:p>
     <w:p>
       <w:r>
-        <w:t>F-DATA's job-name field is anonymized and replaced with a 384-dimensional Sentence-BERT embedding. Feeding 384 raw dimensions into a random forest or gradient-boosted tree model is impractical, so the plan called for reducing it with PCA to, in the proposal's words, "a handful of components." I had originally set that handful to 10 without checking what fraction of the embedding's variance 10 components actually capture.</w:t>
+        <w:t>F-DATA's job-name field is anonymized and replaced with a 384-dimensional Sentence-BERT embedding. Feeding 384 raw dimensions into a random forest or gradient-boosted tree model is impractical, so the original thesis proposal called for reducing it with PCA to "a handful of components." I had originally set that handful to 10 without checking what fraction of the embedding's variance 10 components actually capture.</w:t>
       </w:r>
     </w:p>
     <w:p>
@@ -819,7 +819,7 @@
     </w:p>
     <w:p>
       <w:r>
-        <w:t>Notebook 03 built the two analytical baselines the plan calls for: a Hierarchical Roofline model for F-DATA, and a calibrated resource-utilization power model for PM100. The two datasets need different treatments here, not just different numbers — F-DATA has the hardware performance counters Roofline requires, and PM100 does not, a distinction established already in Section 3.1.</w:t>
+        <w:t>Notebook 03 built the two analytical baselines this study needs: a Hierarchical Roofline model for F-DATA, and a calibrated resource-utilization power model for PM100. The two datasets need different treatments here, not just different numbers — F-DATA has the hardware performance counters Roofline requires, and PM100 does not, a distinction established already in Section 3.1.</w:t>
       </w:r>
     </w:p>
     <w:p>
@@ -900,7 +900,7 @@
     </w:p>
     <w:p>
       <w:r>
-        <w:t>PM100 has no FLOP, instruction, or performance-counter field anywhere in its schema — confirmed directly against documentation/job_features.md, not assumed from the absence noted in Section 3.1 — so no Roofline variant is computable there. The plan calls instead for a calibrated power model, fixed in functional form by hardware reasoning (an idle baseline plus a linear contribution per allocated resource) with only the coefficients fit to data.</w:t>
+        <w:t>PM100 has no FLOP, instruction, or performance-counter field anywhere in its schema — confirmed directly against documentation/job_features.md, not assumed from the absence noted in Section 3.1 — so no Roofline variant is computable there. This section builds a calibrated power model instead, fixed in functional form by hardware reasoning (an idle baseline plus a linear contribution per allocated resource) with only the coefficients fit to data.</w:t>
       </w:r>
     </w:p>
     <w:p>
@@ -1050,7 +1050,7 @@
     </w:p>
     <w:p>
       <w:r>
-        <w:t>Decision #16 calls for a small, contained side-study alongside the two analytical baselines in Section 5.4: run a handful of GPU kernels locally and check the Roofline construction against real, directly-timed hardware behavior, rather than relying only on a dataset's self-reported counters. Notebook 04 is that side-study, and it doesn't feed into F-DATA or PM100 at all — its only job is to check whether the ceiling formula and the compute/memory-bound classification logic behind notebook 03's F-DATA Roofline actually recover the right answer when the right answer is known in advance.</w:t>
+        <w:t>F-DATA's Roofline in Section 5.4 is built entirely from the dataset's own reported FLOP and bandwidth counters, which leaves one question unanswered: is the construction itself — the ceiling formula, the compute/memory-bound classification — actually correct, or does it only look plausible because the input counters and the output label were computed by related methods? Notebook 04 is a small, self-contained side-study built to answer that, independent of F-DATA and PM100 entirely: run a handful of GPU kernels locally, time them directly, and check whether the same Roofline construction recovers the right answer on hardware where the right answer is known in advance rather than merely self-reported.</w:t>
       </w:r>
     </w:p>
     <w:p>
@@ -1187,7 +1187,7 @@
     </w:p>
     <w:p>
       <w:r>
-        <w:t>The scope limitation from Decision #16 applies exactly as it does elsewhere in this thesis: this workstation's RTX 3090 is neither Fugaku's A64FX nor Marconi100's V100s, so nothing here is a hardware-matched ceiling for either dataset. What it validates is the construction — does a real, measured achieved-performance-versus-intensity relationship take the shape the Roofline theory predicts, on hardware where the correct answer is known in advance. This notebook is self-contained and doesn't feed into any other notebook; per the plan's descope ordering it was flagged as the easiest clean cut if the timeline runs short, since dropping it wouldn't block anything else, but it stayed in scope here.</w:t>
+        <w:t>The same scope limitation stated for F-DATA's own Roofline applies here too, for the same reason: this workstation's RTX 3090 is neither Fugaku's A64FX nor Marconi100's V100s, so nothing here is a hardware-matched ceiling for either dataset. What it validates is the construction — does a real, measured achieved-performance-versus-intensity relationship take the shape the Roofline theory predicts, on hardware where the correct answer is known in advance. This notebook is self-contained and doesn't feed into any other notebook, which made it the cheapest piece of this work to have cut entirely had time run short elsewhere — it didn't, so it stayed in scope.</w:t>
       </w:r>
     </w:p>
     <w:sectPr>

</xml_diff>

<commit_message>
correct Section 4.4 Roofline attribution, add Chapter 5 classical-ML results
4.4: the R2=-0.164 / naive R2=0.080 Roofline figures are the full 38-month,
6,992,514-row test-split results, not the six-month dev slice the earlier
text implied. Dev slice now stated separately and labelled as such; the
'full-scale run left for a later notebook' deferral is removed (it is done).

5.3 (new): classical-ML baselines for F-DATA duration and PM100 power from
notebook 05 (Result 1 / Result 2 windows, R2-vs-MAPE disagreement, the
num_nodes_req cross-validation against the calibrated power model).

5.4 (new): F-DATA memory results and the PM100 memory mem_req investigation
from notebook 05b, narrated as the investigative sequence.
</commit_message>
<xml_diff>
--- a/writing/thesis_draft_notes.docx
+++ b/writing/thesis_draft_notes.docx
@@ -12,7 +12,7 @@
     </w:p>
     <w:p>
       <w:r>
-        <w:t>This document collects the writing-ready material produced while building the data pipeline for this thesis, organized by the chapter each section is expected to land in. None of this is final prose — line numbers, wording, and even section order will change once the surrounding chapters exist — but the substance, the numbers, and the reasoning behind each decision are accurate as of this draft and worth keeping rather than reconstructing later from memory.</w:t>
+        <w:t>This document collects the writing-ready material produced while building the data pipeline for this thesis, organized by the chapter each section is expected to land in. None of this is final prose (line numbers, wording, and even section order will change once the surrounding chapters exist), but the substance, the numbers, and the reasoning behind each decision are accurate as of this draft and worth keeping rather than reconstructing later from memory.</w:t>
       </w:r>
     </w:p>
     <w:p>
@@ -38,12 +38,12 @@
     </w:p>
     <w:p>
       <w:r>
-        <w:t>F-DATA arrived as 38 monthly parquet files, one per month from March 2021 through April 2024, totaling 25,866,900 job records — a number I confirmed directly from parquet metadata rather than the approximately-24-million figure quoted in the dataset's own paper. The file count is worth stating carefully: when this pipeline first ran, only one of the 38 files had actually been downloaded, and the loading code printed how many of the expected 38 it found rather than assuming the full set was present. All 38 were confirmed present by listing the directory directly — March 2021 through April 2024 with no gaps — before any of the numbers in this chapter that depend on the full date range were computed. PM100 is a single file of 231,238 jobs from Marconi100, covering May through October 2020.</w:t>
+        <w:t>F-DATA arrived as 38 monthly parquet files, one per month from March 2021 through April 2024, totaling 25,866,900 job records, a number I confirmed directly from parquet metadata rather than the approximately-24-million figure quoted in the dataset's own paper. The file count is worth stating carefully: when this pipeline first ran, only one of the 38 files had actually been downloaded, and the loading code printed how many of the expected 38 it found rather than assuming the full set was present. All 38 were confirmed present by listing the directory directly (March 2021 through April 2024 with no gaps) before any of the numbers in this chapter that depend on the full date range were computed. PM100 is a single file of 231,238 jobs from Marconi100, covering May through October 2020.</w:t>
       </w:r>
     </w:p>
     <w:p>
       <w:r>
-        <w:t>The original project proposal described both systems as heterogeneous CPU-GPU workloads. That framing does not survive contact with the schema. Fugaku's A64FX processors are CPU-only — there is no GPU field to speak of in F-DATA — while PM100's nodes do carry GPUs. F-DATA's columns include six hardware performance counters (labeled perf1 through perf6), a FLOP count, memory bandwidth, and an operational-intensity field, none of which appear anywhere in PM100. I searched PM100's 35 columns for anything matching flop, perf, cycle, instr, mbwidth, or opint as a final check before ruling out Roofline-style analysis there, and found nothing. The two datasets are complementary, not symmetric: F-DATA supports genuine Roofline analysis because it has the hardware counters that method needs, and PM100 does not.</w:t>
+        <w:t>The original project proposal described both systems as heterogeneous CPU-GPU workloads. That framing does not survive contact with the schema. Fugaku's A64FX processors are CPU-only, with no GPU field to speak of in F-DATA, while PM100's nodes do carry GPUs. F-DATA's columns include six hardware performance counters (labeled perf1 through perf6), a FLOP count, memory bandwidth, and an operational-intensity field, none of which appear anywhere in PM100. I searched PM100's 35 columns for anything matching flop, perf, cycle, instr, mbwidth, or opint as a final check before ruling out Roofline-style analysis there, and found nothing. The two datasets are complementary, not symmetric: F-DATA supports genuine Roofline analysis because it has the hardware counters that method needs, and PM100 does not.</w:t>
       </w:r>
     </w:p>
     <w:p>
@@ -56,17 +56,17 @@
     </w:p>
     <w:p>
       <w:r>
-        <w:t>F-DATA's three prediction targets are duration (execution time), mmszu (memory used), and avgpcon (power). PM100's are run_time, mem_alloc, and node_power_consumption. PM100 has no field recording memory actually used, only requested and allocated amounts, so mem_alloc is not a preference between two options — it is the only one available.</w:t>
+        <w:t>F-DATA's three prediction targets are duration (execution time), mmszu (memory used), and avgpcon (power). PM100's are run_time, mem_alloc, and node_power_consumption. PM100 has no field recording memory actually used, only requested and allocated amounts, so mem_alloc is not a preference between two options; it is the only one available.</w:t>
       </w:r>
     </w:p>
     <w:p>
       <w:r>
-        <w:t>avgpcon needed a closer look before I trusted it as a target. Its documented name, average node power consumption, implies a single node's draw, but the maximum value in a 5,000-row sample was 259,097 watts — far beyond anything a single A64FX node could draw. Restricting to single-node jobs (nnuma == 1) brought the range down to 39.6–149.9 watts, consistent with published A64FX power figures, and avgpcon correlated with the number of allocated nodes at 0.98. The field is a job-level total, summed across every allocated node and averaged over time, not a per-node figure. I checked the unit consistency a second way: dividing avgpcon multiplied by duration by the recorded energy field (econ) gave a ratio clustering around 1/3600 across the sample, which is exactly what you would expect if avgpcon is in watts, duration is in seconds, and econ is recorded in watt-hours rather than joules. The numbers are internally consistent once the units are understood correctly; the column name is just misleading about scope. This has one concrete consequence for later chapters: F-DATA's avgpcon and PM100's node_power_consumption turn out to be the same category of field — both measure a job's total power draw, summed across every node it used, not a single node's reading. Section 4.4 confirmed this directly for node_power_consumption, by dividing each job's mean power by its allocated node count and finding the result holds close to constant, 677–732 watts, across node counts from 1 to 32 — a true per-node reading would not need that division to land in the same range at every scale. The two fields measure the same kind of quantity, but not the same hardware or the same job scale, and any table that puts them side by side still needs to say so.</w:t>
+        <w:t>avgpcon needed a closer look before I trusted it as a target. Its documented name, average node power consumption, implies a single node's draw, but the maximum value in a 5,000-row sample was 259,097 watts, far beyond anything a single A64FX node could draw. Restricting to single-node jobs (nnuma == 1) brought the range down to 39.6–149.9 watts, consistent with published A64FX power figures, and avgpcon correlated with the number of allocated nodes at 0.98. The field is a job-level total, summed across every allocated node and averaged over time, not a per-node figure. I checked the unit consistency a second way: dividing avgpcon multiplied by duration by the recorded energy field (econ) gave a ratio clustering around 1/3600 across the sample, which is exactly what you would expect if avgpcon is in watts, duration is in seconds, and econ is recorded in watt-hours rather than joules. The numbers are internally consistent once the units are understood correctly; the column name is just misleading about scope. This has one concrete consequence for later chapters: F-DATA's avgpcon and PM100's node_power_consumption turn out to be the same category of field. Both measure a job's total power draw, summed across every node it used, not a single node's reading. Section 4.4 confirmed this directly for node_power_consumption, by dividing each job's mean power by its allocated node count and finding the result holds close to constant, 677–732 watts, across node counts from 1 to 32. A true per-node reading would not need that division to land in the same range at every scale. The two fields measure the same kind of quantity, but not the same hardware or the same job scale, and any table that puts them side by side still needs to say so.</w:t>
       </w:r>
     </w:p>
     <w:p>
       <w:r>
-        <w:t>Execution time, memory, and power are all heavy-tailed in both datasets: most jobs are short and small, and a long tail of much larger jobs pulls the mean well above the median. F-DATA's duration in a 5,000-row sample ranges from 1 second to 255,677 seconds (about 71 hours), with a median around 2,000 seconds — the kind of spread that will dominate a mean-squared-error loss if targets are trained on in raw units. All six targets across both datasets are therefore modeled in log1p space, with metrics reported back in real units afterward for interpretability. I did not assume the transform was safe; expm1(log1p(x)) was checked against the original values for all six targets and matched to within floating-point precision.</w:t>
+        <w:t>Execution time, memory, and power are all heavy-tailed in both datasets: most jobs are short and small, and a long tail of much larger jobs pulls the mean well above the median. F-DATA's duration in a 5,000-row sample ranges from 1 second to 255,677 seconds (about 71 hours), with a median around 2,000 seconds, the kind of spread that will dominate a mean-squared-error loss if targets are trained on in raw units. All six targets across both datasets are therefore modeled in log1p space, with metrics reported back in real units afterward for interpretability. I did not assume the transform was safe; expm1(log1p(x)) was checked against the original values for all six targets and matched to within floating-point precision.</w:t>
       </w:r>
     </w:p>
     <w:p>
@@ -76,7 +76,7 @@
       <w:r>
         <w:drawing>
           <wp:inline xmlns:a="http://schemas.openxmlformats.org/drawingml/2006/main" xmlns:pic="http://schemas.openxmlformats.org/drawingml/2006/picture">
-            <wp:extent cx="5029200" cy="1981200"/>
+            <wp:extent cx="5029200" cy="1905000"/>
             <wp:docPr id="1" name="Picture 1"/>
             <wp:cNvGraphicFramePr>
               <a:graphicFrameLocks noChangeAspect="1"/>
@@ -97,7 +97,7 @@
                   <pic:spPr>
                     <a:xfrm>
                       <a:off x="0" y="0"/>
-                      <a:ext cx="5029200" cy="1981200"/>
+                      <a:ext cx="5029200" cy="1905000"/>
                     </a:xfrm>
                     <a:prstGeom prst="rect"/>
                   </pic:spPr>
@@ -132,7 +132,7 @@
       <w:r>
         <w:drawing>
           <wp:inline xmlns:a="http://schemas.openxmlformats.org/drawingml/2006/main" xmlns:pic="http://schemas.openxmlformats.org/drawingml/2006/picture">
-            <wp:extent cx="5029200" cy="1981200"/>
+            <wp:extent cx="5029200" cy="1985211"/>
             <wp:docPr id="2" name="Picture 2"/>
             <wp:cNvGraphicFramePr>
               <a:graphicFrameLocks noChangeAspect="1"/>
@@ -153,7 +153,7 @@
                   <pic:spPr>
                     <a:xfrm>
                       <a:off x="0" y="0"/>
-                      <a:ext cx="5029200" cy="1981200"/>
+                      <a:ext cx="5029200" cy="1985211"/>
                     </a:xfrm>
                     <a:prstGeom prst="rect"/>
                   </pic:spPr>
@@ -183,7 +183,7 @@
       <w:r>
         <w:drawing>
           <wp:inline xmlns:a="http://schemas.openxmlformats.org/drawingml/2006/main" xmlns:pic="http://schemas.openxmlformats.org/drawingml/2006/picture">
-            <wp:extent cx="5029200" cy="1983203"/>
+            <wp:extent cx="5029200" cy="1981200"/>
             <wp:docPr id="3" name="Picture 3"/>
             <wp:cNvGraphicFramePr>
               <a:graphicFrameLocks noChangeAspect="1"/>
@@ -204,7 +204,7 @@
                   <pic:spPr>
                     <a:xfrm>
                       <a:off x="0" y="0"/>
-                      <a:ext cx="5029200" cy="1983203"/>
+                      <a:ext cx="5029200" cy="1981200"/>
                     </a:xfrm>
                     <a:prstGeom prst="rect"/>
                   </pic:spPr>
@@ -234,7 +234,7 @@
       <w:r>
         <w:drawing>
           <wp:inline xmlns:a="http://schemas.openxmlformats.org/drawingml/2006/main" xmlns:pic="http://schemas.openxmlformats.org/drawingml/2006/picture">
-            <wp:extent cx="5029200" cy="1981200"/>
+            <wp:extent cx="5029200" cy="1983203"/>
             <wp:docPr id="4" name="Picture 4"/>
             <wp:cNvGraphicFramePr>
               <a:graphicFrameLocks noChangeAspect="1"/>
@@ -255,7 +255,7 @@
                   <pic:spPr>
                     <a:xfrm>
                       <a:off x="0" y="0"/>
-                      <a:ext cx="5029200" cy="1981200"/>
+                      <a:ext cx="5029200" cy="1983203"/>
                     </a:xfrm>
                     <a:prstGeom prst="rect"/>
                   </pic:spPr>
@@ -336,7 +336,7 @@
       <w:r>
         <w:drawing>
           <wp:inline xmlns:a="http://schemas.openxmlformats.org/drawingml/2006/main" xmlns:pic="http://schemas.openxmlformats.org/drawingml/2006/picture">
-            <wp:extent cx="5029200" cy="1981200"/>
+            <wp:extent cx="5029200" cy="1957473"/>
             <wp:docPr id="6" name="Picture 6"/>
             <wp:cNvGraphicFramePr>
               <a:graphicFrameLocks noChangeAspect="1"/>
@@ -357,7 +357,7 @@
                   <pic:spPr>
                     <a:xfrm>
                       <a:off x="0" y="0"/>
-                      <a:ext cx="5029200" cy="1981200"/>
+                      <a:ext cx="5029200" cy="1957473"/>
                     </a:xfrm>
                     <a:prstGeom prst="rect"/>
                   </pic:spPr>
@@ -392,7 +392,7 @@
       <w:r>
         <w:drawing>
           <wp:inline xmlns:a="http://schemas.openxmlformats.org/drawingml/2006/main" xmlns:pic="http://schemas.openxmlformats.org/drawingml/2006/picture">
-            <wp:extent cx="5029200" cy="1708704"/>
+            <wp:extent cx="5029200" cy="1663161"/>
             <wp:docPr id="7" name="Picture 7"/>
             <wp:cNvGraphicFramePr>
               <a:graphicFrameLocks noChangeAspect="1"/>
@@ -413,7 +413,7 @@
                   <pic:spPr>
                     <a:xfrm>
                       <a:off x="0" y="0"/>
-                      <a:ext cx="5029200" cy="1708704"/>
+                      <a:ext cx="5029200" cy="1663161"/>
                     </a:xfrm>
                     <a:prstGeom prst="rect"/>
                   </pic:spPr>
@@ -443,7 +443,7 @@
       <w:r>
         <w:drawing>
           <wp:inline xmlns:a="http://schemas.openxmlformats.org/drawingml/2006/main" xmlns:pic="http://schemas.openxmlformats.org/drawingml/2006/picture">
-            <wp:extent cx="5029200" cy="1708704"/>
+            <wp:extent cx="5029200" cy="1678070"/>
             <wp:docPr id="8" name="Picture 8"/>
             <wp:cNvGraphicFramePr>
               <a:graphicFrameLocks noChangeAspect="1"/>
@@ -464,7 +464,7 @@
                   <pic:spPr>
                     <a:xfrm>
                       <a:off x="0" y="0"/>
-                      <a:ext cx="5029200" cy="1708704"/>
+                      <a:ext cx="5029200" cy="1678070"/>
                     </a:xfrm>
                     <a:prstGeom prst="rect"/>
                   </pic:spPr>
@@ -502,7 +502,7 @@
     </w:p>
     <w:p>
       <w:r>
-        <w:t>I split every feature into two tiers to make this distinction impossible to blur by accident. Tier A holds only what is known at submission time: requested cores, nodes, and memory; queue and priority; requested wall time; an anonymized job-name embedding; and, for F-DATA, a rolling average of each user's recent job durations computed using only jobs strictly before the current one. On the current dev sample, that rolling average was populated for 4,426 of 4,721 F-DATA jobs (93.8 percent) and 3,717 of 3,952 PM100 jobs (94.1 percent) — high coverage at this scale, but notebook 02 flags it as provisional rather than final: with only a handful of scattered months loaded so far, many of these rolling averages rest on very few prior jobs per user rather than a full window, and both the coverage rate and the values themselves are expected to firm up once more of the dataset is loaded. Tier B holds everything measured during or after execution — allocated versus used resources, exit codes, the hardware counters, and the power fields. Tier A is what a scheduler could actually use to predict a job's behavior before running it; Tier B exists for characterizing what happened after the fact and for the residual-learning step of the hybrid model described in Chapter 4. The two tiers are built by separate functions rather than one function with a flag, specifically so that mixing them requires deliberately writing code to do it. An assertion checks for column overlap between the two lists every time the module loads, and a second assertion re-checks after every transformation step in the feature pipeline, not just once at the start.</w:t>
+        <w:t>I split every feature into two tiers to make this distinction impossible to blur by accident. Tier A holds only what is known at submission time: requested cores, nodes, and memory; queue and priority; requested wall time; an anonymized job-name embedding; and, for F-DATA, a rolling average of each user's recent job durations computed using only jobs strictly before the current one. On the current dev sample, that rolling average was populated for 4,426 of 4,721 F-DATA jobs (93.8 percent) and 3,717 of 3,952 PM100 jobs (94.1 percent). Coverage is high at this scale, but notebook 02 flags it as provisional rather than final: with only a handful of scattered months loaded so far, many of these rolling averages rest on very few prior jobs per user rather than a full window, and both the coverage rate and the values themselves are expected to firm up once more of the dataset is loaded. Tier B holds everything measured during or after execution: allocated versus used resources, exit codes, the hardware counters, and the power fields. Tier A is what a scheduler could actually use to predict a job's behavior before running it; Tier B exists for characterizing what happened after the fact and for the residual-learning step of the hybrid model described in Chapter 4. The two tiers are built by separate functions rather than one function with a flag, specifically so that mixing them requires deliberately writing code to do it. An assertion checks for column overlap between the two lists every time the module loads, and a second assertion re-checks after every transformation step in the feature pipeline, not just once at the start.</w:t>
       </w:r>
     </w:p>
     <w:p>
@@ -520,7 +520,7 @@
     </w:p>
     <w:p>
       <w:r>
-        <w:t>It turned out to be 68 percent on a single month's data — nowhere near enough to justify the number. I replaced the fixed default with an empirical check: fit PCA with up to 100 components, look at cumulative explained variance, and keep the smallest number that reaches a 90 percent threshold. On a sample drawn from one month, that threshold needed 43 components. On a sample drawn from five months spread across the full date range, it needed 59. The gap makes sense once you think about what the embedding encodes: a wider span of months carries more distinct job names and, presumably, more distinct applications, so capturing the same share of variance takes more components. The number is not fixed until a fit is done against the full 38-month dataset; treat 59 as current, not final.</w:t>
+        <w:t>It turned out to be 68 percent on a single month's data, nowhere near enough to justify the number. I replaced the fixed default with an empirical check: fit PCA with up to 100 components, look at cumulative explained variance, and keep the smallest number that reaches a 90 percent threshold. On a sample drawn from one month, that threshold needed 43 components. On a sample drawn from five months spread across the full date range, it needed 59. The gap makes sense once you think about what the embedding encodes: a wider span of months carries more distinct job names and, presumably, more distinct applications, so capturing the same share of variance takes more components. The number is not fixed until a fit is done against the full 38-month dataset; treat 59 as current, not final.</w:t>
       </w:r>
     </w:p>
     <w:p>
@@ -576,7 +576,7 @@
     </w:p>
     <w:p>
       <w:r>
-        <w:t>I also decided, after an earlier round of discussion, to use the PCA-reduced embedding everywhere — for the tree-based models and for the neural network architectures alike — rather than giving the deep learning models the option of the raw 384-dimensional vector, which the original proposal allowed for. The reason is practical rather than statistical: loading the raw embedding for the full F-DATA dataset measures at over 100 gigabytes of resident memory, against roughly 27 gigabytes for every other column combined, because each row's embedding is stored as an individually allocated array rather than one contiguous block. Section 4.2 covers this measurement and the loading strategy it led to in more detail.</w:t>
+        <w:t>I also decided, after an earlier round of discussion, to use the PCA-reduced embedding everywhere (for the tree-based models and for the neural network architectures alike) rather than giving the deep learning models the option of the raw 384-dimensional vector, which the original proposal allowed for. The reason is practical rather than statistical: loading the raw embedding for the full F-DATA dataset measures at over 100 gigabytes of resident memory, against roughly 27 gigabytes for every other column combined, because each row's embedding is stored as an individually allocated array rather than one contiguous block. Section 4.2 covers this measurement and the loading strategy it led to in more detail.</w:t>
       </w:r>
     </w:p>
     <w:p>
@@ -589,17 +589,17 @@
     </w:p>
     <w:p>
       <w:r>
-        <w:t>Three PM100 columns are Tier A candidates and all three have missing values, but at very different rates: num_tasks is missing in 4.1 percent of jobs, req_nodes in 88.6 percent, and threads_per_core in 99.6 percent. Treating all three the same way — impute and move on — would have missed what turned out to be a fairly consequential distinction, so I worked through a four-part check on each candidate before deciding whether its derived feature belonged in the active Tier A set.</w:t>
+        <w:t>Three PM100 columns are Tier A candidates and all three have missing values, but at very different rates: num_tasks is missing in 4.1 percent of jobs, req_nodes in 88.6 percent, and threads_per_core in 99.6 percent. Treating all three the same way (impute and move on) would have missed what turned out to be a fairly consequential distinction, so I worked through a four-part check on each candidate before deciding whether its derived feature belonged in the active Tier A set.</w:t>
       </w:r>
     </w:p>
     <w:p>
       <w:r>
-        <w:t>The first check is simply whether the missingness reflects an optional field or an incomplete one. req_nodes, when populated, holds a specific node identifier — values like [763] or [878] — which is Slurm's explicit node-pinning flag (--nodelist). Most jobs do not ask for a particular machine, so the field is null by design for them, not because logging failed. threads_per_core is the same story: its only non-null values are 1, 2, or 4, matching Slurm's explicit hyperthreading override (--threads-per-core), a setting almost nobody touches. num_tasks has no such documented optional-flag semantics; its gaps look like ordinary incomplete logging.</w:t>
+        <w:t>The first check is simply whether the missingness reflects an optional field or an incomplete one. req_nodes, when populated, holds a specific node identifier (values like [763] or [878]), which is Slurm's explicit node-pinning flag (--nodelist). Most jobs do not ask for a particular machine, so the field is null by design for them, not because logging failed. threads_per_core is the same story: its only non-null values are 1, 2, or 4, matching Slurm's explicit hyperthreading override (--threads-per-core), a setting almost nobody touches. num_tasks has no such documented optional-flag semantics; its gaps look like ordinary incomplete logging.</w:t>
       </w:r>
     </w:p>
     <w:p>
       <w:r>
-        <w:t>The second check is effect size against the three prediction targets, using median comparisons rather than leaning on p-values alone — at roughly 180,000 completed jobs, a Mann-Whitney test will report significance for almost any difference, trivial or not. All three derived flags (node_pinned, threads_per_core_set, and num_tasks_missing) showed real median differences. threads_per_core_set showed the largest of the three by a wide margin: median run_time roughly four times higher, median memory roughly four times lower, when the flag is set.</w:t>
+        <w:t>The second check is effect size against the three prediction targets, using median comparisons rather than leaning on p-values alone: at roughly 180,000 completed jobs, a Mann-Whitney test will report significance for almost any difference, trivial or not. All three derived flags (node_pinned, threads_per_core_set, and num_tasks_missing) showed real median differences. threads_per_core_set showed the largest of the three by a wide margin: median run_time roughly four times higher, median memory roughly four times lower, when the flag is set.</w:t>
       </w:r>
     </w:p>
     <w:p>
@@ -655,12 +655,12 @@
     </w:p>
     <w:p>
       <w:r>
-        <w:t>The third check is redundancy: does an existing categorical column already carry the same information as the flag being considered? I cross-tabulated threads_per_core_set against partition, quality-of-service class, and GPU allocation. None of them explained it — the flag is set almost exclusively within the system's single dominant partition and QoS class, which is where nearly every job lives regardless, and GPU allocation among flagged jobs was close to the overall rate. Ruling out redundancy raised my confidence in the flag rather than lowering it, which is why the fourth check mattered more than I expected going in.</w:t>
+        <w:t>The third check is redundancy: does an existing categorical column already carry the same information as the flag being considered? I cross-tabulated threads_per_core_set against partition, quality-of-service class, and GPU allocation. None of them explained it: the flag is set almost exclusively within the system's single dominant partition and QoS class, which is where nearly every job lives regardless, and GPU allocation among flagged jobs was close to the overall rate. Ruling out redundancy raised my confidence in the flag rather than lowering it, which is why the fourth check mattered more than I expected going in.</w:t>
       </w:r>
     </w:p>
     <w:p>
       <w:r>
-        <w:t>The fourth check is user concentration: is the signal broad, or is it a handful of individual users' behavior showing up as if it were a general pattern? Both datasets are naturally dominated by a small number of heavy users — PM100's top five account for 45.4 percent of all completed jobs, F-DATA's top five for 41.4 percent in a five-month sample — so some concentration is expected and not automatically disqualifying. The question is how much concentration is too much. node_pinned turned out to be far more concentrated than that baseline: only 19 users ever set it, and the top five account for 99.3 percent of every pinned job, 73.5 percent from one user alone. threads_per_core_set was similarly narrow: only 6 users, 85 percent of occurrences from a single one of them. num_tasks_missing, by contrast, spans 101 distinct users with the top five accounting for 47.1 percent — close enough to the dataset's own baseline that it reads as a genuine pattern rather than a few users' signature.</w:t>
+        <w:t>The fourth check is user concentration: is the signal broad, or is it a handful of individual users' behavior showing up as if it were a general pattern? Both datasets are naturally dominated by a small number of heavy users (PM100's top five account for 45.4 percent of all completed jobs, F-DATA's top five for 41.4 percent in a five-month sample), so some concentration is expected and not automatically disqualifying. The question is how much concentration is too much. node_pinned turned out to be far more concentrated than that baseline: only 19 users ever set it, and the top five account for 99.3 percent of every pinned job, 73.5 percent from one user alone. threads_per_core_set was similarly narrow: only 6 users, 85 percent of occurrences from a single one of them. num_tasks_missing, by contrast, spans 101 distinct users with the top five accounting for 47.1 percent, close enough to the dataset's own baseline that it reads as a genuine pattern rather than a few users' signature.</w:t>
       </w:r>
     </w:p>
     <w:p>
@@ -716,17 +716,17 @@
     </w:p>
     <w:p>
       <w:r>
-        <w:t>Only num_tasks_missing passes all four checks, and it is the feature promoted into the active Tier A set. node_pinned and threads_per_core_set are both computed and kept in the processed dataset — along with the raw req_nodes and threads_per_core columns — but excluded from the general feature set, reserved for a narrower, explicitly scoped analysis later (a power-specific submodel is the most likely candidate, given threads_per_core_set's relationship to SMT settings) where the single-user-concentration caveat can be addressed directly rather than quietly inherited by every model that uses Tier A. threads_per_core_set having the largest raw effect size of the three, and still being the one excluded, is worth stating plainly: effect size on its own was not sufficient evidence, and would have been misleading without the concentration check that followed it.</w:t>
+        <w:t>Only num_tasks_missing passes all four checks, and it is the feature promoted into the active Tier A set. node_pinned and threads_per_core_set are both computed and kept in the processed dataset (along with the raw req_nodes and threads_per_core columns) but excluded from the general feature set, reserved for a narrower, explicitly scoped analysis later (a power-specific submodel is the most likely candidate, given threads_per_core_set's relationship to SMT settings) where the single-user-concentration caveat can be addressed directly rather than quietly inherited by every model that uses Tier A. threads_per_core_set having the largest raw effect size of the three, and still being the one excluded, is worth stating plainly: effect size on its own was not sufficient evidence, and would have been misleading without the concentration check that followed it.</w:t>
       </w:r>
     </w:p>
     <w:p>
       <w:r>
-        <w:t>That decision covers three candidate features. It says nothing about whether the same problem was already sitting undetected somewhere in the feature set built before this vetting process existed, so I went back and ran the same concentration check against every PM100 Tier A column that predates it. One failed outright: req_switch, a Slurm switch-count field already in active use, has only 13 non-zero values across 180,310 completed jobs, and all 13 come from a single user — a worse concentration ratio than threads_per_core_set, which had already been excluded for the same reason. req_switch has now been moved to the same reserved category, with a derived req_switch_set flag preserved alongside it for consistency. The rest of the audit came back clean: shared's two populated categories each hold tens of thousands of jobs, nowhere near single-user territory, and the smallest categories of qos and partition, while occasionally tiny, are legitimate multi-valued scheduling fields rather than purpose-built rare flags, so ordinary small-category noise there is not the same concern. F-DATA's one comparable column, jobenv_req, showed a milder version of the same pattern — its minority value spans 21 users with a 39.2 percent top-user share, above F-DATA's own baseline concentration of 16.0 percent but well short of PM100's excluded flags — and is left active for now, flagged for a second look once more months of F-DATA are loaded.</w:t>
+        <w:t>That decision covers three candidate features. It says nothing about whether the same problem was already sitting undetected somewhere in the feature set built before this vetting process existed, so I went back and ran the same concentration check against every PM100 Tier A column that predates it. One failed outright: req_switch, a Slurm switch-count field already in active use, has only 13 non-zero values across 180,310 completed jobs, and all 13 come from a single user, a worse concentration ratio than threads_per_core_set, which had already been excluded for the same reason. req_switch has now been moved to the same reserved category, with a derived req_switch_set flag preserved alongside it for consistency. The rest of the audit came back clean: shared's two populated categories each hold tens of thousands of jobs, nowhere near single-user territory, and the smallest categories of qos and partition, while occasionally tiny, are legitimate multi-valued scheduling fields rather than purpose-built rare flags, so ordinary small-category noise there is not the same concern. F-DATA's one comparable column, jobenv_req, showed a milder version of the same pattern (its minority value spans 21 users with a 39.2 percent top-user share, above F-DATA's own baseline concentration of 16.0 percent but well short of PM100's excluded flags) and is left active for now, flagged for a second look once more months of F-DATA are loaded.</w:t>
       </w:r>
     </w:p>
     <w:p>
       <w:r>
-        <w:t>There is a second, broader question this whole exercise raised that is worth stating on its own rather than folding into the feature-by-feature discussion above: given that a handful of users account for close to half of all jobs in both datasets, does the chronological train/test split planned for later chapters risk giving an unrepresentative slice of any one heavy user's jobs to training versus testing? I checked this for PM100's five heaviest users directly, rather than leaving it as an open question. All five are active across 97 to 100 percent of the dataset's full 159-day span, with one exception reaching 76 percent after starting roughly a month into the window — none of them are concentrated in a narrow slice of time that a chronological split could isolate entirely on one side. That is a reassuring result, but it is specific to PM100. F-DATA spans 38 months rather than 6, which is a much longer window for a user's activity to plausibly shift, taper off, or start partway through before the dataset ends, and that check has not yet been run there. The Feature Vetting method described in this section should be treated as an ongoing discipline for this thesis rather than a step that was completed once and closed — the fact that it caught req_switch on a second pass, after already being applied once, is itself the argument for continuing to apply it as new features and the full-scale dataset come into the pipeline.</w:t>
+        <w:t>There is a second, broader question this whole exercise raised that is worth stating on its own rather than folding into the feature-by-feature discussion above: given that a handful of users account for close to half of all jobs in both datasets, does the chronological train/test split planned for later chapters risk giving an unrepresentative slice of any one heavy user's jobs to training versus testing? I checked this for PM100's five heaviest users directly, rather than leaving it as an open question. All five are active across 97 to 100 percent of the dataset's full 159-day span, with one exception reaching 76 percent after starting roughly a month into the window. None of them are concentrated in a narrow slice of time that a chronological split could isolate entirely on one side. That is a reassuring result, but it is specific to PM100. F-DATA spans 38 months rather than 6, which is a much longer window for a user's activity to plausibly shift, taper off, or start partway through before the dataset ends, and that check has not yet been run there. The Feature Vetting method described in this section should be treated as an ongoing discipline for this thesis rather than a step that was completed once and closed: the fact that it caught req_switch on a second pass, after already being applied once, is itself the argument for continuing to apply it as new features and the full-scale dataset come into the pipeline.</w:t>
       </w:r>
     </w:p>
     <w:p>
@@ -739,7 +739,7 @@
     </w:p>
     <w:p>
       <w:r>
-        <w:t>Both datasets record jobs that failed, were cancelled, or hit resource limits before completing. Their duration and power figures reflect the failure, not ordinary workload behavior, so both datasets are filtered to completed jobs only before any target is computed. F-DATA's exit-state field is a clean binary and excludes 5.1–5.6 percent of jobs depending on the sample; PM100's job-state field has six values — completed, failed, cancelled, timeout, out-of-memory, and node failure — and excludes a notably larger 21.0 percent. That gap between the two systems' failure rates is itself worth stating explicitly rather than treating the two datasets as symmetric on this point.</w:t>
+        <w:t>Both datasets record jobs that failed, were cancelled, or hit resource limits before completing. Their duration and power figures reflect the failure, not ordinary workload behavior, so both datasets are filtered to completed jobs only before any target is computed. F-DATA's exit-state field is a clean binary and excludes 5.1–5.6 percent of jobs depending on the sample; PM100's job-state field has six values (completed, failed, cancelled, timeout, out-of-memory, and node failure) and excludes a notably larger 21.0 percent. That gap between the two systems' failure rates is itself worth stating explicitly rather than treating the two datasets as symmetric on this point.</w:t>
       </w:r>
     </w:p>
     <w:p>
@@ -757,7 +757,7 @@
     </w:p>
     <w:p>
       <w:r>
-        <w:t>This chapter covers how the work in this thesis was built, set up, and validated — the computing environment, the memory constraints that shaped the data-loading strategy, the notebook-execution tooling, and the construction and validation of the two analytical baselines. Model architectures and training procedures for the classical ML, deep learning, and hybrid models will be added here once that work exists; this is not the complete chapter.</w:t>
+        <w:t>This chapter covers how the work in this thesis was built, set up, and validated: the computing environment, the memory constraints that shaped the data-loading strategy, the notebook-execution tooling, and the construction and validation of the two analytical baselines. Model architectures and training procedures for the classical ML, deep learning, and hybrid models will be added here once that work exists; this is not the complete chapter.</w:t>
       </w:r>
     </w:p>
     <w:p>
@@ -770,7 +770,7 @@
     </w:p>
     <w:p>
       <w:r>
-        <w:t>Work on this thesis began on a single workstation with an Intel i9-10900X (10 cores, 20 threads), 125 gigabytes of RAM, and one NVIDIA RTX 3090. It moved partway through to a replacement machine — an Intel i9-10980XE (18 cores, 36 threads), 251 gigabytes of RAM, and four NVIDIA RTX 3090 Ti cards — because the original's memory could not hold F-DATA's embedding matrix at full scale and a single GPU bottlenecks the later deep-learning stage. Every full-scale result reported here was produced on the replacement machine, and the microbenchmark validation of Section 4.5 was re-measured on one of its RTX 3090 Ti cards. The environment is managed with uv rather than plain pip, pinned to Python 3.12 rather than the newer 3.13 available on the system. That choice was not arbitrary: numba, a dependency of the SHAP interpretability library used later in this work, does not yet build cleanly under Python 3.13. More specifically, resolving the full dependency set under the newer Python version led the package resolver to select numba 0.53.1, a version old enough that its own dependency, llvmlite, refuses to build at all above Python 3.9. The fix needed an explicit lower bound on numba in the project's dependency list; without it, the resolver's preference for a version whose metadata claims unbounded compatibility, even when that claim is stale, wins over a modern release that correctly declares its actual constraints. PyTorch is installed from the CUDA 13.0 build, matching the workstation's driver version exactly, and its GPU detection was confirmed directly rather than assumed from the installation succeeding.</w:t>
+        <w:t>Work on this thesis began on a single workstation with an Intel i9-10900X (10 cores, 20 threads), 125 gigabytes of RAM, and one NVIDIA RTX 3090. It moved partway through to a replacement machine, an Intel i9-10980XE with 18 cores and 36 threads, 251 gigabytes of RAM, and four NVIDIA RTX 3090 Ti cards, because the original's memory could not hold F-DATA's embedding matrix at full scale and a single GPU bottlenecks the later deep-learning stage. Every full-scale result reported here was produced on the replacement machine, and the microbenchmark validation of Section 4.5 was re-measured on one of its RTX 3090 Ti cards. The environment is managed with uv rather than plain pip, pinned to Python 3.12 rather than the newer 3.13 available on the system. That choice was not arbitrary: numba, a dependency of the SHAP interpretability library used later in this work, does not yet build cleanly under Python 3.13. More specifically, resolving the full dependency set under the newer Python version led the package resolver to select numba 0.53.1, a version old enough that its own dependency, llvmlite, refuses to build at all above Python 3.9. The fix needed an explicit lower bound on numba in the project's dependency list; without it, the resolver's preference for a version whose metadata claims unbounded compatibility, even when that claim is stale, wins over a modern release that correctly declares its actual constraints. PyTorch is installed from the CUDA 13.0 build, matching the workstation's driver version exactly, and its GPU detection was confirmed directly rather than assumed from the installation succeeding.</w:t>
       </w:r>
     </w:p>
     <w:p>
@@ -783,7 +783,7 @@
     </w:p>
     <w:p>
       <w:r>
-        <w:t>F-DATA's 38 monthly files total roughly 26 gigabytes on disk, comfortably within the workstation's storage, but disk size is not the same question as memory footprint once loaded. Measuring one month's file directly: loading all 45 columns costs 5.54 gigabytes of resident memory, while loading the same file without the embedding column costs 1.39 gigabytes. Scaled to the full 25,866,900-row dataset, that difference becomes significant — upwards of 100 gigabytes with the embedding included, against roughly 27 gigabytes without it. Given 125 gigabytes of total RAM, the first scenario would leave little headroom for anything else running on the machine, let alone for the model training this dataset exists to support.</w:t>
+        <w:t>F-DATA's 38 monthly files total roughly 26 gigabytes on disk, comfortably within the workstation's storage, but disk size is not the same question as memory footprint once loaded. Measuring one month's file directly: loading all 45 columns costs 5.54 gigabytes of resident memory, while loading the same file without the embedding column costs 1.39 gigabytes. Scaled to the full 25,866,900-row dataset, that difference becomes significant: upwards of 100 gigabytes with the embedding included, against roughly 27 gigabytes without it. Given 125 gigabytes of total RAM, the first scenario would leave little headroom for anything else running on the machine, let alone for the model training this dataset exists to support.</w:t>
       </w:r>
     </w:p>
     <w:p>
@@ -801,7 +801,7 @@
     </w:p>
     <w:p>
       <w:r>
-        <w:t>Early runs of the data-loading notebook appeared to hang for extended periods with no visible output, which turned out to have two distinct causes rather than one. The first was calling a generic describe() across a dataframe that still included the embedding column: pandas attempts to compute uniqueness and mode statistics on that column, which means comparing unhashable NumPy arrays across a million rows, and the fallback path for that is slow rather than an outright error. The second was treating PM100's node_power_consumption as if it were a single number per job, when it is in fact a time series — power sampled roughly every 20 seconds for the duration of the job, which is exactly the kind of sequence data the LSTM and TCN architectures later in this chapter are meant to use. Both were fixed at the source rather than worked around: the embedding column is excluded from any generic summary call, and any scalar treatment of the power column reduces the sequence to a per-job mean explicitly first.</w:t>
+        <w:t>Early runs of the data-loading notebook appeared to hang for extended periods with no visible output, which turned out to have two distinct causes rather than one. The first was calling a generic describe() across a dataframe that still included the embedding column: pandas attempts to compute uniqueness and mode statistics on that column, which means comparing unhashable NumPy arrays across a million rows, and the fallback path for that is slow rather than an outright error. The second was treating PM100's node_power_consumption as if it were a single number per job, when it is in fact a time series, power sampled roughly every 20 seconds for the duration of the job, which is exactly the kind of sequence data the LSTM and TCN architectures later in this chapter are meant to use. Both were fixed at the source rather than worked around: the embedding column is excluded from any generic summary call, and any scalar treatment of the power column reduces the sequence to a per-job mean explicitly first.</w:t>
       </w:r>
     </w:p>
     <w:p>
@@ -811,7 +811,7 @@
     </w:p>
     <w:p>
       <w:r>
-        <w:t>Sections 4.4 and 4.5 are one methodological thread, not two separate topics. F-DATA's Roofline ceiling in 4.4 is built entirely from the dataset's own reported FLOP and bandwidth counters, which leaves the construction itself unverified: does the ceiling formula and its compute/memory-bound classification actually recover the right answer, on hardware where the right answer is independently known, rather than only looking plausible because the same source produced both the inputs and the label it's checked against? Section 4.5 exists to answer exactly that, using controlled GPU kernels timed directly on this workstation rather than F-DATA's self-reported figures. 4.4 describes what was built; 4.5 describes why it can be trusted. The actual outcomes of both — the R² and MAPE numbers, the calibrated coefficients, the classification results — are reported afterward, in Chapter 5.</w:t>
+        <w:t>Sections 4.4 and 4.5 are one methodological thread, not two separate topics. F-DATA's Roofline ceiling in 4.4 is built entirely from the dataset's own reported FLOP and bandwidth counters, which leaves the construction itself unverified: does the ceiling formula and its compute/memory-bound classification actually recover the right answer, on hardware where the right answer is independently known, rather than only looking plausible because the same source produced both the inputs and the label it's checked against? Section 4.5 exists to answer exactly that, using controlled GPU kernels timed directly on this workstation rather than F-DATA's self-reported figures. 4.4 describes what was built; 4.5 describes why it can be trusted. The actual outcomes of both (the R² and MAPE numbers, the calibrated coefficients, the classification results) are reported afterward, in Chapter 5.</w:t>
       </w:r>
     </w:p>
     <w:p>
@@ -824,27 +824,32 @@
     </w:p>
     <w:p>
       <w:r>
-        <w:t>Notebook 03 built the two analytical baselines this study needs: a Hierarchical Roofline model for F-DATA (Yang et al. 2019), and a calibrated resource-utilization power model for PM100. The two datasets need different treatments here, not just different numbers — F-DATA has the hardware performance counters Roofline requires, and PM100 does not, a distinction established already in Section 3.1.</w:t>
+        <w:t>Notebook 03 built the two analytical baselines this study needs: a Hierarchical Roofline model for F-DATA (Yang et al. 2019), and a calibrated resource-utilization power model for PM100. The two datasets need different treatments here, not just different numbers: F-DATA has the hardware performance counters Roofline requires, and PM100 does not, a distinction established already in Section 3.1.</w:t>
       </w:r>
     </w:p>
     <w:p>
       <w:r>
-        <w:t>F-DATA was loaded as six consecutive monthly files, March through August 2021, rather than the scattered-month sampling used in notebooks 01 and 02. The chronological train/test split this notebook needed only makes sense across a real, contiguous span of time, and six scattered months would not have given one. PM100 was loaded in full, as it has been throughout. Both datasets were filtered to completed jobs only, the same filter used since Section 3.6: 10.5 percent of F-DATA's 2,897,734 loaded rows were excluded on this six-month slice, and 22.0 percent of PM100's 231,238 rows. That PM100 figure is measured on this notebook's own six-month window and is not the same measurement as the 21.0 percent reported in Section 3.6 against a different sample — the two numbers are close but come from different slices of the dataset, not from the same computation repeated.</w:t>
+        <w:t>Notebook 03 was first developed and run on a six-month slice of F-DATA: the consecutive files from March through August 2021, rather than the scattered-month sampling notebooks 01 and 02 used at that point. A chronological train/test split only makes sense across a contiguous span of time, and six scattered months would not have provided one. That six-month slice held 2,897,734 F-DATA rows; the completed-jobs filter from Section 3.6 removed 10.5 percent of them, leaving 2,593,124. PM100 was loaded in full, as everywhere else in this thesis: 231,238 rows, 22.0 percent removed by the same filter, leaving 180,310.</w:t>
       </w:r>
     </w:p>
     <w:p>
       <w:r>
-        <w:t>A chronological split was implemented for the first time in this notebook: 70 percent of each dataset's rows by submission time go to training, the remaining 30 percent to testing, with the boundary itself computed as a quantile of submission time rather than hand-picked. For F-DATA that boundary fell on July 1, 2021, giving 1,815,596 training rows and 777,528 test rows. For PM100 it fell on September 19, 2020, giving 126,217 training rows and 54,093 test rows. This split is now implemented once, in a shared module, so every notebook from here forward compares models against the same boundary rather than each picking its own.</w:t>
+        <w:t>The chronological split was implemented here for the first time and then reused unchanged by every later notebook. Submission time is sorted, the 70th percentile becomes the boundary, jobs before it train and jobs after it test, with the boundary computed as a quantile rather than hand-picked. On the six-month F-DATA slice the boundary fell on July 1, 2021, giving 1,815,596 training and 777,528 test rows. On PM100 it fell on September 19, 2020, giving 126,217 training and 54,093 test rows. The split lives in a shared module, so every model in this thesis is measured against the same boundary.</w:t>
       </w:r>
     </w:p>
     <w:p>
       <w:r>
-        <w:t>F-DATA's Roofline ceiling comes from the A64FX processor's published specifications: 3.3792 teraFLOP/s double-precision peak and 1024 gigabytes/second of peak HBM2 bandwidth, both per node. Before trusting any of this, I checked two things directly against the data rather than assuming them from the column documentation. First, that opint, F-DATA's own operational-intensity field, actually equals flops divided by mbwidth: it does, with a relative error of 0.00e+00 across all 2,593,124 completed jobs in this sample, meaning F-DATA's authors precompute it exactly and I did not need to recompute it myself. Second, that flops and mbwidth are job-wide totals rather than per-node figures, the same question Section 3.2 raised about avgpcon. The check was direct: 977 jobs appear to exceed the A64FX's single-node peak FLOP/s if node count is ignored, but zero jobs exceed it once each job's rate is divided by its node count. Both fields are job-wide totals, so the ceiling applied below is scaled by each job's node count before comparison.</w:t>
+        <w:t>F-DATA's Roofline ceiling comes from the A64FX processor's published specifications: 3.3792 teraFLOP/s double-precision peak and 1024 gigabytes per second of peak HBM2 bandwidth, both per node. I checked two things directly against the data before trusting the ceiling, rather than taking them from the column documentation. The first is that opint, F-DATA's own operational-intensity field, equals flops divided by mbwidth. It does, exactly, to a relative error of 0.00e+00 on the six-month slice, so F-DATA's authors precompute it and it does not need recomputing. The second is that flops and mbwidth are job-wide totals rather than per-node figures, the same question Section 3.2 raised about avgpcon. On the six-month slice, 977 jobs exceeded the A64FX's single-node peak FLOP/s when node count was ignored, and none exceeded it once each job's rate was divided by its node count. Both fields are job-wide totals, so the ceiling is scaled by each job's node count before any comparison.</w:t>
       </w:r>
     </w:p>
     <w:p>
       <w:r>
-        <w:t>PM100 has no FLOP, instruction, or performance-counter field anywhere in its schema — confirmed directly against documentation/job_features.md, not assumed from the absence noted in Section 3.1 — so no Roofline variant is computable there. This section builds a calibrated power model instead, fixed in functional form by hardware reasoning (an idle baseline plus a linear contribution per allocated resource) with only the coefficients fit to data.</w:t>
+        <w:t>I later re-ran the notebook across all 38 months of F-DATA on the replacement workstation described in Section 4.1. At that scale the completed-jobs filter removed 9.9 percent of 25,866,900 rows, leaving 23,308,381, split 70/30 by submission time into 16,315,867 training and 6,992,514 test rows. The two direct checks above were repeated on the full population and held: opint matched flops divided by mbwidth exactly across all 23,308,381 jobs, and no job exceeded the per-node compute peak after scaling by node count. Every Roofline number reported in Chapter 5, including its accuracy against held-out execution time, comes from this full-scale run. The six-month figures above describe only the development slice the construction was built and debugged on.</w:t>
+      </w:r>
+    </w:p>
+    <w:p>
+      <w:r>
+        <w:t>PM100 has no FLOP, instruction, or performance-counter field anywhere in its schema (confirmed directly against documentation/job_features.md, not assumed from the absence noted in Section 3.1), so no Roofline variant is computable there. This section builds a calibrated power model instead, fixed in functional form by hardware reasoning (an idle baseline plus a linear contribution per allocated resource) with only the coefficients fit to data.</w:t>
       </w:r>
     </w:p>
     <w:p>
@@ -905,12 +910,12 @@
     </w:p>
     <w:p>
       <w:r>
-        <w:t>Before fitting anything, I checked how the model's four predictors — allocated nodes, cores, GPUs, and memory — relate to each other, since Marconi100 assigns cores, GPUs, and memory to a job in close to a fixed ratio per node. They are correlated with each other at 0.85 to 0.97 across every pair. That is worth knowing before looking at the calibrated coefficients, reported in Chapter 5, not after.</w:t>
+        <w:t>Before fitting anything, I checked how the model's four predictors (allocated nodes, cores, GPUs, and memory) relate to each other, since Marconi100 assigns cores, GPUs, and memory to a job in close to a fixed ratio per node. They are correlated with each other at 0.85 to 0.97 across every pair. That is worth knowing before looking at the calibrated coefficients, reported in Chapter 5, not after.</w:t>
       </w:r>
     </w:p>
     <w:p>
       <w:r>
-        <w:t>F-DATA's Roofline baseline and PM100's power model are not directly comparable to each other — different formulas, different physical quantities, and different targets, execution time against power. Any table in this thesis that places both side by side, including the one notebook 03 builds for its own recordkeeping, exists for convenience of layout, not as a claim that the two numbers mean the same thing.</w:t>
+        <w:t>F-DATA's Roofline baseline and PM100's power model are not directly comparable to each other: different formulas, different physical quantities, and different targets, execution time against power. Any table in this thesis that places both side by side, including the one notebook 03 builds for its own recordkeeping, exists for convenience of layout, not as a claim that the two numbers mean the same thing.</w:t>
       </w:r>
     </w:p>
     <w:p>
@@ -920,7 +925,7 @@
     </w:p>
     <w:p>
       <w:r>
-        <w:t>Three things are deferred past this notebook. The Roofline analysis above covers six of F-DATA's 38 months; the full-scale run is left for a later notebook, consistent with the dev-scale approach used throughout this chapter. The rolling-window temporal-drift check across F-DATA's full span, separate from the single chronological split used here, has not been run. And both baselines built here — Roofline, the naive median, and the calibrated power model — are meant to be reused in the full evaluation sweep planned for notebook 08, sitting in the same comparison tables as the random forest, gradient-boosted tree, feedforward, recurrent, and hybrid models covered in later chapters.</w:t>
+        <w:t>Two things are deferred past this notebook. The rolling-window temporal-drift check across F-DATA's full span, training on one window and testing on the next while sliding forward, is separate from the single chronological split used here and has not been run. And the baselines built here, Roofline and the naive median for F-DATA and the calibrated power model for PM100, are meant to be reused in the full evaluation sweep planned for notebook 08, in the same comparison tables as the random forest, gradient-boosted tree, feedforward, recurrent, and hybrid models covered in later chapters.</w:t>
       </w:r>
     </w:p>
     <w:p>
@@ -938,12 +943,12 @@
     </w:p>
     <w:p>
       <w:r>
-        <w:t>It runs on the replacement workstation's own RTX 3090 Ti, confirmed directly rather than assumed: a full GA102 die, 84 streaming multiprocessors, compute capability 8.6, 25.3 gigabytes of memory. Published specs put its double-precision peak at 0.625 teraFLOP/s and its single-precision peak at 40.0 teraFLOP/s — consumer Ampere runs FP64 at 1/64 the FP32 rate, a restriction a datacenter part like the A100 doesn't share — and its memory bandwidth at 1008 gigabytes per second across a 384-bit GDDR6X bus clocked at 21 gigabits per second. The original workstation's plain RTX 3090 put these at 35.58 and 0.556 teraFLOP/s and 936.2 gigabytes per second; the first run of this validation used those figures.</w:t>
+        <w:t>It runs on the replacement workstation's own RTX 3090 Ti, confirmed directly rather than assumed: a full GA102 die, 84 streaming multiprocessors, compute capability 8.6, 25.3 gigabytes of memory. Published specs put its double-precision peak at 0.625 teraFLOP/s and its single-precision peak at 40.0 teraFLOP/s (consumer Ampere runs FP64 at 1/64 the FP32 rate, a restriction a datacenter part like the A100 doesn't share), and its memory bandwidth at 1008 gigabytes per second across a 384-bit GDDR6X bus clocked at 21 gigabits per second. The original workstation's plain RTX 3090 put these at 35.58 and 0.556 teraFLOP/s and 936.2 gigabytes per second; the first run of this validation used those figures.</w:t>
       </w:r>
     </w:p>
     <w:p>
       <w:r>
-        <w:t>NAS Parallel Benchmarks and Rodinia's kernel suite were the natural source material for this side-study, following Konstantinidis et al. 2017's microbenchmark-based Roofline approach. Neither suite was actually compiled and run here; four standard operations implemented directly in PyTorch substitute for them — vector_add (SAXPY/DAXPY), dot_product, gemv (matrix-vector multiply), and gemm (matrix-matrix multiply) — chosen to span the same low-to-high arithmetic-intensity range Rodinia's kernels do, in less time than standing up an external C/CUDA build. None of these four resemble anything in F-DATA's actual job mix, and that's not an oversight: this notebook validates the Roofline construction itself, not F-DATA's workload characteristics, and validating a construction requires kernels whose FLOP count and byte count are known exactly, so their true compute- or memory-bound regime is known in advance. F-DATA's own jobs offer no such independent ground truth — only the dataset's own precomputed pclass label, which risks confirming the same method it's meant to check rather than testing it against something external. Konstantinidis et al. 2017's own approach uses this same logic: synthetic, controlled kernels trace a GPU's achievable-performance curve independent of whatever workload eventually runs against it. Dense linear algebra isn't an arbitrary stand-in either — GEMM and GEMV underlie a large share of real scientific computing, including several NAS Parallel Benchmarks kernels (Bailey et al. 1991) — but no claim is made that these four kernels reproduce F-DATA's actual jobs; that would need profiling real F-DATA-representative application code, which is out of scope here.</w:t>
+        <w:t>NAS Parallel Benchmarks and Rodinia's kernel suite were the natural source material for this side-study, following Konstantinidis et al. 2017's microbenchmark-based Roofline approach. Neither suite was actually compiled and run here; four standard operations implemented directly in PyTorch substitute for them: vector_add (SAXPY/DAXPY), dot_product, gemv (matrix-vector multiply), and gemm (matrix-matrix multiply). These four were chosen to span the same low-to-high arithmetic-intensity range Rodinia's kernels do, in less time than standing up an external C/CUDA build. None of these four resemble anything in F-DATA's actual job mix, and that's not an oversight: this notebook validates the Roofline construction itself, not F-DATA's workload characteristics, and validating a construction requires kernels whose FLOP count and byte count are known exactly, so their true compute- or memory-bound regime is known in advance. F-DATA's own jobs offer no such independent ground truth, only the dataset's own precomputed pclass label, which risks confirming the same method it's meant to check rather than testing it against something external. Konstantinidis et al. 2017's own approach uses this same logic: synthetic, controlled kernels trace a GPU's achievable-performance curve independent of whatever workload eventually runs against it. Dense linear algebra isn't an arbitrary stand-in either (GEMM and GEMV underlie a large share of real scientific computing, including several NAS Parallel Benchmarks kernels from Bailey et al. 1991), but no claim is made that these four kernels reproduce F-DATA's actual jobs; that would need profiling real F-DATA-representative application code, which is out of scope here.</w:t>
       </w:r>
     </w:p>
     <w:p>
@@ -953,17 +958,17 @@
     </w:p>
     <w:p>
       <w:r>
-        <w:t>Building this validation surfaced a real finding along the way, not a bug. The first version of the sanity checks failed: vector_add at the smallest FP32 size (1,000,000 elements, an 8-megabyte working set across its two arrays) measured 115.1 percent of the RTX 3090 Ti's 1008 gigabyte-per-second DRAM peak. The same kernel at 5,000,000 elements (40 megabytes) and above measured a normal 87 to 90 percent, so the excess was confined to a single point. On the original RTX 3090 the same measurement came out at 124.6 percent of that card's lower 936.2 gigabyte-per-second peak — a larger excess, because the L2 cache's fixed contribution is a bigger fraction of a smaller denominator. The explanation is the GPU's memory hierarchy, not measurement error: the timing harness calls the same kernel on the same tensors twenty times in a row, and GA102's 6-megabyte L2 cache is large enough to serve a meaningful share of an 8-megabyte working set's repeated accesses, so the achieved rate reflects a blend of cache and DRAM bandwidth rather than DRAM alone. dot_product at the identical working set didn't show the same excess (52.9 percent of peak), and FP64 vector_add at the same element count — a 16-megabyte working set, twice the bytes — didn't either (82.9 percent), which ruled out working-set size alone as the explanation. The specific memory-access pattern matters too: a reduction kernel apparently doesn't benefit from repeated-call cache residency the way a straightforward elementwise write does. I fixed this by adding a working-set-size field to each kernel result and excluding rows within twice the L2 cache size from the DRAM-bandwidth check, a carve-out justified by the specific row it was built to explain rather than a tolerance loosened until the assertion stopped failing.</w:t>
+        <w:t>Building this validation surfaced a real finding along the way, not a bug. The first version of the sanity checks failed: vector_add at the smallest FP32 size (1,000,000 elements, an 8-megabyte working set across its two arrays) measured 115.1 percent of the RTX 3090 Ti's 1008 gigabyte-per-second DRAM peak. The same kernel at 5,000,000 elements (40 megabytes) and above measured a normal 87 to 90 percent, so the excess was confined to a single point. On the original RTX 3090 the same measurement came out at 124.6 percent of that card's lower 936.2 gigabyte-per-second peak: a larger excess, because the L2 cache's fixed contribution is a bigger fraction of a smaller denominator. The explanation is the GPU's memory hierarchy, not measurement error: the timing harness calls the same kernel on the same tensors twenty times in a row, and GA102's 6-megabyte L2 cache is large enough to serve a meaningful share of an 8-megabyte working set's repeated accesses, so the achieved rate reflects a blend of cache and DRAM bandwidth rather than DRAM alone. dot_product at the identical working set didn't show the same excess (52.9 percent of peak), and FP64 vector_add at the same element count (a 16-megabyte working set, twice the bytes) didn't either (82.9 percent), which ruled out working-set size alone as the explanation. The specific memory-access pattern matters too: a reduction kernel apparently doesn't benefit from repeated-call cache residency the way a straightforward elementwise write does. I fixed this by adding a working-set-size field to each kernel result and excluding rows within twice the L2 cache size from the DRAM-bandwidth check, a carve-out justified by the specific row it was built to explain rather than a tolerance loosened until the assertion stopped failing.</w:t>
       </w:r>
     </w:p>
     <w:p>
       <w:r>
-        <w:t>This ties directly back to why Yang et al. 2019's Hierarchical Roofline, introduced in Section 4.4, models multiple bandwidth levels — L1, L2, device memory, system memory — rather than a single DRAM figure. A roofline built against DRAM bandwidth alone is exactly the kind of model a small, cache-friendly problem can appear to violate, when what actually happened is the problem ran against a faster level of the memory hierarchy instead. F-DATA's own Roofline used a single measured bandwidth field and couldn't have caught this the way a controlled microbenchmark can — worth remembering when reading Section 4.4's ceiling as if it captured the whole hierarchy, since it doesn't.</w:t>
+        <w:t>This ties directly back to why Yang et al. 2019's Hierarchical Roofline, introduced in Section 4.4, models multiple bandwidth levels (L1, L2, device memory, system memory) rather than a single DRAM figure. A roofline built against DRAM bandwidth alone is exactly the kind of model a small, cache-friendly problem can appear to violate, when what actually happened is the problem ran against a faster level of the memory hierarchy instead. F-DATA's own Roofline used a single measured bandwidth field and couldn't have caught this the way a controlled microbenchmark can; it is worth remembering when reading Section 4.4's ceiling as if it captured the whole hierarchy, since it doesn't.</w:t>
       </w:r>
     </w:p>
     <w:p>
       <w:r>
-        <w:t>The same scope limitation stated for F-DATA's own Roofline applies here too, for the same reason: this workstation's RTX 3090 Ti is neither Fugaku's A64FX nor Marconi100's V100s, so nothing here is a hardware-matched ceiling for either dataset. What it validates is the construction — does a real, measured achieved-performance-versus-intensity relationship take the shape the Roofline theory predicts, on hardware where the correct answer is known in advance. This notebook is self-contained and doesn't feed into any other notebook, which made it the cheapest piece of this work to have cut entirely had time run short elsewhere — it didn't, so it stayed in scope.</w:t>
+        <w:t>The same scope limitation stated for F-DATA's own Roofline applies here too, for the same reason: this workstation's RTX 3090 Ti is neither Fugaku's A64FX nor Marconi100's V100s, so nothing here is a hardware-matched ceiling for either dataset. What it validates is the construction: does a real, measured achieved-performance-versus-intensity relationship take the shape the Roofline theory predicts, on hardware where the correct answer is known in advance. This notebook is self-contained and doesn't feed into any other notebook, which made it the cheapest piece of this work to have cut entirely had time run short elsewhere. It didn't, so it stayed in scope.</w:t>
       </w:r>
     </w:p>
     <w:p>
@@ -981,7 +986,7 @@
     </w:p>
     <w:p>
       <w:r>
-        <w:t>This chapter reports what the methodology in Chapter 4 actually produced: the analytical baselines' accuracy against held-out data, and the microbenchmark validation's classification results. Model-training results for the classical ML, deep learning, and hybrid models will be added here once that work exists; this is not the complete chapter.</w:t>
+        <w:t>This chapter reports what the methodology in Chapter 4 actually produced: the analytical baselines' accuracy against held-out data, the microbenchmark validation's classification results, and the classical machine-learning baselines for execution time, power, and memory. Deep-learning and hybrid-model results will be added once notebooks 06 through 09 exist; this is not yet the complete chapter.</w:t>
       </w:r>
     </w:p>
     <w:p>
@@ -1050,7 +1055,7 @@
     </w:p>
     <w:p>
       <w:r>
-        <w:t>The Roofline ceiling implies a best-case duration for every job: how long it would take running at the fastest rate its own measured operational intensity allows. Evaluated against actual duration on the held-out test split, this scored an R² of -0.164 and a MAPE of 99.98 percent. A naive baseline — each job's own user's median duration over their training-period jobs, falling back to the training-period global median for users with no training history — scored an R² of 0.080 and a MAPE of 8,369 percent on the same split. The Roofline figure being negative is not a bug in the baseline. The Roofline ceiling assumes a job spends its entire wall-clock duration running at peak achievable rate, with no time lost to I/O, synchronization, or any other non-compute phase, so its predicted durations come out roughly five orders of magnitude below actual ones — a job predicted to finish in a fraction of a second actually running for thousands of seconds is the expected outcome of that assumption, not a sign the ceiling was computed wrong. The naive baseline's enormous MAPE is a known property of that metric when actual values sit close to zero — F-DATA's minimum recorded duration is 1 second — rather than evidence the median itself is a bad estimate; RMSE and R² tell a more usable story for this baseline than MAPE does on its own. Both baselines are exactly the floor the classical ML, deep learning, and hybrid models in later chapters need to clear, and a physics-informed model landing this far below even a naive median is itself worth stating plainly in this thesis rather than only reporting the numbers that make later models look good.</w:t>
+        <w:t>The Roofline ceiling implies a best-case duration for every job: how long it would take running at the fastest rate its own measured operational intensity allows. Evaluated against actual duration on the held-out test split, this scored an R² of -0.164 and a MAPE of 99.98 percent. A naive baseline (each job's own user's median duration over their training-period jobs, falling back to the training-period global median for users with no training history) scored an R² of 0.080 and a MAPE of 8,369 percent on the same split. The Roofline figure being negative is not a bug in the baseline. The Roofline ceiling assumes a job spends its entire wall-clock duration running at peak achievable rate, with no time lost to I/O, synchronization, or any other non-compute phase, so its predicted durations come out roughly five orders of magnitude below actual ones: a job predicted to finish in a fraction of a second actually running for thousands of seconds is the expected outcome of that assumption, not a sign the ceiling was computed wrong. The naive baseline's enormous MAPE is a known property of that metric when actual values sit close to zero (F-DATA's minimum recorded duration is 1 second) rather than evidence the median itself is a bad estimate; RMSE and R² tell a more usable story for this baseline than MAPE does on its own. Both baselines are exactly the floor the classical ML, deep learning, and hybrid models in later chapters need to clear, and a physics-informed model landing this far below even a naive median is itself worth stating plainly in this thesis rather than only reporting the numbers that make later models look good.</w:t>
       </w:r>
     </w:p>
     <w:p>
@@ -1111,7 +1116,7 @@
     </w:p>
     <w:p>
       <w:r>
-        <w:t>On the held-out test split, the calibrated model scored an R² of 0.910 and a MAPE of 21.82 percent, against the naive per-user-median baseline's R² of 0.096 and MAPE of 49.75 percent on the same jobs — a wide margin in the calibrated model's favor. Read together with the Roofline results above, the two analytical baselines behave very differently relative to their own naive floors: PM100's power target turns out to be far more predictable from allocated resources alone than F-DATA's duration is from a user's own recent history, across the full F-DATA span and the full PM100 dataset. The model's predictions are trustworthy on this evidence; its individual coefficients, for the reason given above, are not.</w:t>
+        <w:t>On the held-out test split, the calibrated model scored an R² of 0.910 and a MAPE of 21.82 percent, against the naive per-user-median baseline's R² of 0.096 and MAPE of 49.75 percent on the same jobs, a wide margin in the calibrated model's favor. Read together with the Roofline results above, the two analytical baselines behave very differently relative to their own naive floors: PM100's power target turns out to be far more predictable from allocated resources alone than F-DATA's duration is from a user's own recent history, across the full F-DATA span and the full PM100 dataset. The model's predictions are trustworthy on this evidence; its individual coefficients, for the reason given above, are not.</w:t>
       </w:r>
     </w:p>
     <w:p>
@@ -1124,7 +1129,7 @@
     </w:p>
     <w:p>
       <w:r>
-        <w:t>Unlike F-DATA, the RTX 3090 Ti kernels described in Section 4.5 have a regime known in advance by construction: vector_add and dot_product are memory-bound at any problem size, and gemm should move toward compute-bound as the matrix size grows, since its FLOPs scale with the cube of the dimension against memory traffic that only scales with the square. The classification logic recovered exactly that in every run — vector_add and dot_product classified memory-bound in 8 of 8 runs at both precisions, and the largest gemm (8192×8192) classified compute-bound, reaching 74.7 percent of the FP32 peak and 95.1 percent of the FP64 peak. The crippled consumer FP64 rate is low enough that a modestly sized GEMM nearly saturates it. Because these kernels' true regime is known independently rather than only cross-checked against a dataset's own label, this is a stronger validation of the Roofline construction than the F-DATA Roofline's own 99.974 percent pclass agreement in Section 5.1 was.</w:t>
+        <w:t>Unlike F-DATA, the RTX 3090 Ti kernels described in Section 4.5 have a regime known in advance by construction: vector_add and dot_product are memory-bound at any problem size, and gemm should move toward compute-bound as the matrix size grows, since its FLOPs scale with the cube of the dimension against memory traffic that only scales with the square. The classification logic recovered exactly that in every run: vector_add and dot_product classified memory-bound in 8 of 8 runs at both precisions, and the largest gemm (8192×8192) classified compute-bound, reaching 74.7 percent of the FP32 peak and 95.1 percent of the FP64 peak. The crippled consumer FP64 rate is low enough that a modestly sized GEMM nearly saturates it. Because these kernels' true regime is known independently rather than only cross-checked against a dataset's own label, this is a stronger validation of the Roofline construction than the F-DATA Roofline's own 99.974 percent pclass agreement in Section 5.1 was.</w:t>
       </w:r>
     </w:p>
     <w:p>
@@ -1226,7 +1231,98 @@
           <w:i/>
           <w:sz w:val="20"/>
         </w:rPr>
-        <w:t>Figure 5.4. RTX 3090 Ti measured Roofline, FP64. Same construction as Figure 5.3, against FP64's much lower 0.625 TFLOP/s compute-bound ceiling — GEMM saturates it at far smaller matrix sizes than in FP32.</w:t>
+        <w:t>Figure 5.4. RTX 3090 Ti measured Roofline, FP64. Same construction as Figure 5.3, against FP64's much lower 0.625 TFLOP/s compute-bound ceiling. GEMM saturates it at far smaller matrix sizes than in FP32.</w:t>
+      </w:r>
+    </w:p>
+    <w:p>
+      <w:pPr>
+        <w:pStyle w:val="Heading2"/>
+      </w:pPr>
+      <w:r>
+        <w:t>5.3 Classical Machine-Learning Baselines: Execution Time and Power</w:t>
+      </w:r>
+    </w:p>
+    <w:p>
+      <w:r>
+        <w:t>Notebook 05 fits three tree-ensemble models, a random forest and the gradient-boosted libraries XGBoost and LightGBM, against F-DATA's execution time and PM100's power, using only submission-time (Tier A) features. Each model gets the same fixed search budget: a 50-trial Optuna sweep over its own hyperparameters, tuned on a chronological validation carve-out that never touches the test split. Targets are fit in log1p space and metrics are reported back in raw units. For F-DATA the sweep runs on a one-million-row sample stratified by job size, and the final model is refit on the full 16,315,867-row training split, except the random forest, which is capped at five million rows for the final fit alone (a disclosed deviation: sklearn's forest has no GPU path and gains little past a few million rows). PM100's training split is already smaller than that sample would be, so it is used in full. The naive per-user-median baseline from Section 5.1 carries over as the floor.</w:t>
+      </w:r>
+    </w:p>
+    <w:p>
+      <w:r>
+        <w:t>On F-DATA execution time, with a five-job rolling mean of each user's recent durations as the one historical feature, all three models clear both analytical baselines on R² by a wide margin. LightGBM leads at 0.824, XGBoost follows at 0.815, and the random forest trails at 0.771, against the naive baseline's 0.080 and the Roofline ceiling's -0.164 from Section 5.1. The random forest reaching only 0.771 despite roughly ten times the tuning wall-clock time of either boosted library is worth stating plainly: the extra search budget did not buy a better model here. MAPE tells a different story, and the disagreement is real rather than a reporting quirk. Roofline's MAPE of 99.98 percent beats all three ML models, which land between 1,888 and 2,133 percent, even though Roofline loses badly on R². MAPE is dominated by the many short jobs where a small absolute miss is a large percentage; R² and RMSE are dominated by the few very long jobs. Neither metric is wrong, and this thesis reports both rather than choosing whichever one flatters a given model.</w:t>
+      </w:r>
+    </w:p>
+    <w:p>
+      <w:r>
+        <w:t>Widening that historical feature helps. Adding 20-job and 50-job rolling means alongside the 5-job one and refitting at the same tuned hyperparameters lifts every model on every metric: XGBoost to 0.836, LightGBM to 0.831, the random forest to 0.821, with the share of predictions landing within 20 percent of actual rising by several points to around 61 percent. The best model flips from LightGBM to XGBoost in the process. Because this refit reused hyperparameters tuned with only the 5-job feature present, the gain is a lower bound on what a full re-tune would give.</w:t>
+      </w:r>
+    </w:p>
+    <w:p>
+      <w:r>
+        <w:t>On PM100 power the three models sit close together, XGBoost and LightGBM both at an R² of 0.924 and the random forest at 0.902, against the naive baseline's 0.096 and the calibrated power model's 0.910 from Section 5.1. The margin over the analytical baseline is real but narrow, unlike the F-DATA duration case; XGBoost's MAPE of 16.6 percent against the calibrated model's 21.8 percent is the clearer separation. Two findings from this run matter beyond the headline numbers. The single feature carrying the most weight in XGBoost is the requested node count, at 61 percent of total signal by SHAP and 70 percent by split gain, which is the same quantity the Section 5.1 calibrated model was hand-built around when it scaled its idle-power term by node count. A hand-derived physical form and a data-driven tree ensemble independently identified the same dominant driver. Separately, an XGBoost model stripped to just the four resource-request fields scores an R² of 0.901 and a MAPE of 20.3 percent, a near-tie with the calibrated model on equivalent inputs. The full model's edge therefore comes from the broader Tier A feature set carrying information the four-field analytical form was never scoped to use, not from trees fitting the request-to-power relationship better than a calibrated linear form does.</w:t>
+      </w:r>
+    </w:p>
+    <w:p>
+      <w:r>
+        <w:t>Across these two targets the best-performing model is already configuration-dependent: LightGBM for F-DATA duration with the single rolling feature, XGBoost once the wider windows are added, XGBoost for PM100 power. That is worth carrying forward rather than settling on one library as the winner.</w:t>
+      </w:r>
+    </w:p>
+    <w:p>
+      <w:pPr>
+        <w:pStyle w:val="Heading2"/>
+      </w:pPr>
+      <w:r>
+        <w:t>5.4 Classical Machine-Learning Baselines: Memory, and What mem_req Was Doing</w:t>
+      </w:r>
+    </w:p>
+    <w:p>
+      <w:r>
+        <w:t>Notebook 05b applies the same structure to memory: F-DATA's mmszu (memory actually used) and PM100's mem_alloc (allocated memory, the only memory field PM100 records). F-DATA's target has a documented fallback to allocated memory for rows where used memory is missing, but used memory has no missing values at all across the 23.3 million completed jobs, so the fallback never fires in practice. Both memory targets were fit with a real 50-trial Optuna sweep per model, no reused hyperparameters. A five-job rolling window won for both, unlike execution time, where the wider windows helped.</w:t>
+      </w:r>
+    </w:p>
+    <w:p>
+      <w:r>
+        <w:t>On F-DATA memory the ranking is LightGBM at an R² of 0.867, the random forest at 0.825, XGBoost at 0.807. The naive per-user-median baseline scores -0.249 here, worse than simply predicting the global mean, which is the only target in this thesis where the per-user median does that badly. The historical rolling-mean feature accounts for roughly 88 percent of LightGBM's gain over that floor.</w:t>
+      </w:r>
+    </w:p>
+    <w:p>
+      <w:r>
+        <w:t>PM100 memory needed a longer look, because the first run of it looked wrong in a specific way. With all 17 features present, the random forest's median absolute error was exactly zero and LightGBM's R² reached 0.985. Numbers that clean usually mean a feature is standing in for the target rather than predicting it, and there was an obvious suspect: mem_req, the requested memory, which on a batch-scheduled system is often granted exactly as asked. This is the same concern raised earlier about requested-versus-allocated fields on PM100 power, but sharper, because here the suspect feature could be a copy of the target itself rather than of another feature.</w:t>
+      </w:r>
+    </w:p>
+    <w:p>
+      <w:r>
+        <w:t>A direct check settled it. Requested memory equals allocated memory exactly on 93.76 percent of test jobs. On the other 6.24 percent, allocation always exceeds the request, by a median of 230 megabytes and a tail out to 58,900. A model that does nothing but echo mem_req to its output scores an R² of 0.705 with no training at all, so most of the 17-feature headline was mechanical rather than learned.</w:t>
+      </w:r>
+    </w:p>
+    <w:p>
+      <w:r>
+        <w:t>The stripped-feature ablation I had set up to catch exactly this was itself compromised: mem_req was one of its four fields. Rebuilding it cleanly, with requested nodes, requested GPUs, requested cores, and the user's rolling mean of past allocations, mem_req removed entirely, scored an R² of 0.968 with XGBoost. That beats both the contaminated ablation and the full 17-feature model. So mem_req was doing more than failing to help on the hard cases; it was degrading the fit across the board.</w:t>
+      </w:r>
+    </w:p>
+    <w:p>
+      <w:r>
+        <w:t>Adding the other twelve production features back on top of the clean four made accuracy worse, not better, with median absolute error rising from under one megabyte to about 69. XGBoost's column subsampling keeps drawing weak columns into each tree, which dilutes the one feature that carries real signal. The usable signal on this target sits in exactly four features.</w:t>
+      </w:r>
+    </w:p>
+    <w:p>
+      <w:r>
+        <w:t>A full 50-trial search specific to the four-feature set moved the result barely at all, from 0.968 to 0.966, so the clean-four advantage is not a tuning artifact. The search surfaced one more thing: the validation metric used during tuning had itself been fooled by mem_req's mechanical echo. The 17-feature model scored a much better tuning-validation error yet did worse on the real test set, and worst of all on the divergent jobs.</w:t>
+      </w:r>
+    </w:p>
+    <w:p>
+      <w:r>
+        <w:t>The contaminated-versus-clean gap held across all three models in the four-field comparison, with divergent-case R² around 0.73 contaminated against 0.95 clean. A supplementary check with all 17 features found a genuine per-model split, though. The random forest and LightGBM partly recover on the divergent jobs when given the full feature set to lean on; XGBoost does not, and its share of divergent-job predictions within 20 percent of actual collapses to 17.9 percent.</w:t>
+      </w:r>
+    </w:p>
+    <w:p>
+      <w:r>
+        <w:t>All three models were set to the clean four-field set, mem_req dropped entirely. For XGBoost the case is straightforward. For the random forest and LightGBM it is a deliberate trade: the full feature set gives a higher aggregate R² (0.977 and 0.985 against the clean set's 0.951 and 0.960), but the clean set gives far more reliable accuracy on the roughly 6 percent of jobs where request and allocation diverge, with median absolute error under one megabyte against 35 to 44. Those divergent jobs are exactly what a genuine submission-time predictor is for, so that is where accuracy was prioritised. On the adopted clean-four set, XGBoost is best at an R² of 0.966, LightGBM at 0.960, the random forest at 0.951; the 17-feature set's best had been LightGBM at 0.985.</w:t>
+      </w:r>
+    </w:p>
+    <w:p>
+      <w:r>
+        <w:t>This is the fourth target-and-dataset pairing in this thesis where the best model changed with the configuration: LightGBM then XGBoost on F-DATA execution time, XGBoost on PM100 power, LightGBM on the 17-feature PM100 memory set, XGBoost on the clean-four set. Best model is a property of the configuration here, not a fixed choice the pipeline can settle once.</w:t>
       </w:r>
     </w:p>
     <w:sectPr>

</xml_diff>